<commit_message>
Update final thesis PDF and Word document
</commit_message>
<xml_diff>
--- a/05_Thesis/chapters/Bachelorarbeit_mohamady.docx
+++ b/05_Thesis/chapters/Bachelorarbeit_mohamady.docx
@@ -125,27 +125,46 @@
       <w:pPr>
         <w:spacing w:after="320"/>
         <w:jc w:val="center"/>
-      </w:pPr>
-      <w:r>
         <w:rPr>
           <w:b/>
           <w:bCs/>
         </w:rPr>
-        <w:t>Mohamed</w:t>
-      </w:r>
+      </w:pPr>
       <w:r>
         <w:rPr>
           <w:b/>
           <w:bCs/>
         </w:rPr>
-        <w:t xml:space="preserve"> Mamdouh Mahmoud</w:t>
+        <w:t>Mohamed</w:t>
       </w:r>
       <w:r>
         <w:rPr>
           <w:b/>
           <w:bCs/>
         </w:rPr>
+        <w:t xml:space="preserve"> Mamdouh Mahmoud</w:t>
+      </w:r>
+      <w:r>
+        <w:rPr>
+          <w:b/>
+          <w:bCs/>
+        </w:rPr>
         <w:t xml:space="preserve"> Mohamady</w:t>
+      </w:r>
+    </w:p>
+    <w:p>
+      <w:pPr>
+        <w:spacing w:after="320"/>
+        <w:jc w:val="center"/>
+      </w:pPr>
+      <w:r>
+        <w:t>M</w:t>
+      </w:r>
+      <w:r>
+        <w:t xml:space="preserve">atrikelnummer: </w:t>
+      </w:r>
+      <w:r>
+        <w:t>6950702</w:t>
       </w:r>
     </w:p>
     <w:p>
@@ -181,8 +200,26 @@
         <w:jc w:val="center"/>
       </w:pPr>
       <w:r>
-        <w:t>27.07.2026</w:t>
-      </w:r>
+        <w:t>Abgabedatum</w:t>
+      </w:r>
+      <w:r>
+        <w:rPr>
+          <w:lang w:val="en-US"/>
+        </w:rPr>
+        <w:t xml:space="preserve">: </w:t>
+      </w:r>
+      <w:r>
+        <w:t>26</w:t>
+      </w:r>
+      <w:r>
+        <w:t>.07.2026</w:t>
+      </w:r>
+    </w:p>
+    <w:p>
+      <w:pPr>
+        <w:spacing w:after="120"/>
+        <w:jc w:val="center"/>
+      </w:pPr>
     </w:p>
     <w:p>
       <w:r>
@@ -219,10 +256,7 @@
         <w:alias w:val="Inhaltsverzeichnis"/>
         <w:id w:val="-1437747563"/>
       </w:sdtPr>
-      <w:sdtEndPr/>
       <w:sdtContent>
-        <w:bookmarkStart w:id="0" w:name="_GoBack" w:displacedByCustomXml="prev"/>
-        <w:bookmarkEnd w:id="0" w:displacedByCustomXml="prev"/>
         <w:p>
           <w:pPr>
             <w:pStyle w:val="TOC1"/>
@@ -245,7 +279,7 @@
           <w:r>
             <w:fldChar w:fldCharType="separate"/>
           </w:r>
-          <w:hyperlink w:anchor="_Toc235835467" w:history="1">
+          <w:hyperlink w:anchor="_Toc235990757" w:history="1">
             <w:r>
               <w:rPr>
                 <w:rStyle w:val="Hyperlink"/>
@@ -269,7 +303,7 @@
               <w:rPr>
                 <w:noProof/>
               </w:rPr>
-              <w:instrText xml:space="preserve"> PAGEREF _Toc235835467 \h </w:instrText>
+              <w:instrText xml:space="preserve"> PAGEREF _Toc235990757 \h </w:instrText>
             </w:r>
             <w:r>
               <w:rPr>
@@ -309,7 +343,7 @@
               <w:szCs w:val="22"/>
             </w:rPr>
           </w:pPr>
-          <w:hyperlink w:anchor="_Toc235835468" w:history="1">
+          <w:hyperlink w:anchor="_Toc235990758" w:history="1">
             <w:r>
               <w:rPr>
                 <w:rStyle w:val="Hyperlink"/>
@@ -333,7 +367,7 @@
               <w:rPr>
                 <w:noProof/>
               </w:rPr>
-              <w:instrText xml:space="preserve"> PAGEREF _Toc235835468 \h </w:instrText>
+              <w:instrText xml:space="preserve"> PAGEREF _Toc235990758 \h </w:instrText>
             </w:r>
             <w:r>
               <w:rPr>
@@ -373,7 +407,7 @@
               <w:szCs w:val="22"/>
             </w:rPr>
           </w:pPr>
-          <w:hyperlink w:anchor="_Toc235835469" w:history="1">
+          <w:hyperlink w:anchor="_Toc235990759" w:history="1">
             <w:r>
               <w:rPr>
                 <w:rStyle w:val="Hyperlink"/>
@@ -397,7 +431,7 @@
               <w:rPr>
                 <w:noProof/>
               </w:rPr>
-              <w:instrText xml:space="preserve"> PAGEREF _Toc235835469 \h </w:instrText>
+              <w:instrText xml:space="preserve"> PAGEREF _Toc235990759 \h </w:instrText>
             </w:r>
             <w:r>
               <w:rPr>
@@ -437,7 +471,7 @@
               <w:szCs w:val="22"/>
             </w:rPr>
           </w:pPr>
-          <w:hyperlink w:anchor="_Toc235835470" w:history="1">
+          <w:hyperlink w:anchor="_Toc235990760" w:history="1">
             <w:r>
               <w:rPr>
                 <w:rStyle w:val="Hyperlink"/>
@@ -461,7 +495,7 @@
               <w:rPr>
                 <w:noProof/>
               </w:rPr>
-              <w:instrText xml:space="preserve"> PAGEREF _Toc235835470 \h </w:instrText>
+              <w:instrText xml:space="preserve"> PAGEREF _Toc235990760 \h </w:instrText>
             </w:r>
             <w:r>
               <w:rPr>
@@ -501,7 +535,7 @@
               <w:szCs w:val="22"/>
             </w:rPr>
           </w:pPr>
-          <w:hyperlink w:anchor="_Toc235835471" w:history="1">
+          <w:hyperlink w:anchor="_Toc235990761" w:history="1">
             <w:r>
               <w:rPr>
                 <w:rStyle w:val="Hyperlink"/>
@@ -525,7 +559,7 @@
               <w:rPr>
                 <w:noProof/>
               </w:rPr>
-              <w:instrText xml:space="preserve"> PAGEREF _Toc235835471 \h </w:instrText>
+              <w:instrText xml:space="preserve"> PAGEREF _Toc235990761 \h </w:instrText>
             </w:r>
             <w:r>
               <w:rPr>
@@ -565,7 +599,7 @@
               <w:szCs w:val="22"/>
             </w:rPr>
           </w:pPr>
-          <w:hyperlink w:anchor="_Toc235835472" w:history="1">
+          <w:hyperlink w:anchor="_Toc235990762" w:history="1">
             <w:r>
               <w:rPr>
                 <w:rStyle w:val="Hyperlink"/>
@@ -589,7 +623,7 @@
               <w:rPr>
                 <w:noProof/>
               </w:rPr>
-              <w:instrText xml:space="preserve"> PAGEREF _Toc235835472 \h </w:instrText>
+              <w:instrText xml:space="preserve"> PAGEREF _Toc235990762 \h </w:instrText>
             </w:r>
             <w:r>
               <w:rPr>
@@ -629,7 +663,7 @@
               <w:szCs w:val="22"/>
             </w:rPr>
           </w:pPr>
-          <w:hyperlink w:anchor="_Toc235835473" w:history="1">
+          <w:hyperlink w:anchor="_Toc235990763" w:history="1">
             <w:r>
               <w:rPr>
                 <w:rStyle w:val="Hyperlink"/>
@@ -653,7 +687,7 @@
               <w:rPr>
                 <w:noProof/>
               </w:rPr>
-              <w:instrText xml:space="preserve"> PAGEREF _Toc235835473 \h </w:instrText>
+              <w:instrText xml:space="preserve"> PAGEREF _Toc235990763 \h </w:instrText>
             </w:r>
             <w:r>
               <w:rPr>
@@ -693,7 +727,7 @@
               <w:szCs w:val="22"/>
             </w:rPr>
           </w:pPr>
-          <w:hyperlink w:anchor="_Toc235835474" w:history="1">
+          <w:hyperlink w:anchor="_Toc235990764" w:history="1">
             <w:r>
               <w:rPr>
                 <w:rStyle w:val="Hyperlink"/>
@@ -717,7 +751,7 @@
               <w:rPr>
                 <w:noProof/>
               </w:rPr>
-              <w:instrText xml:space="preserve"> PAGEREF _Toc235835474 \h </w:instrText>
+              <w:instrText xml:space="preserve"> PAGEREF _Toc235990764 \h </w:instrText>
             </w:r>
             <w:r>
               <w:rPr>
@@ -757,7 +791,7 @@
               <w:szCs w:val="22"/>
             </w:rPr>
           </w:pPr>
-          <w:hyperlink w:anchor="_Toc235835475" w:history="1">
+          <w:hyperlink w:anchor="_Toc235990765" w:history="1">
             <w:r>
               <w:rPr>
                 <w:rStyle w:val="Hyperlink"/>
@@ -781,7 +815,7 @@
               <w:rPr>
                 <w:noProof/>
               </w:rPr>
-              <w:instrText xml:space="preserve"> PAGEREF _Toc235835475 \h </w:instrText>
+              <w:instrText xml:space="preserve"> PAGEREF _Toc235990765 \h </w:instrText>
             </w:r>
             <w:r>
               <w:rPr>
@@ -821,7 +855,7 @@
               <w:szCs w:val="22"/>
             </w:rPr>
           </w:pPr>
-          <w:hyperlink w:anchor="_Toc235835476" w:history="1">
+          <w:hyperlink w:anchor="_Toc235990766" w:history="1">
             <w:r>
               <w:rPr>
                 <w:rStyle w:val="Hyperlink"/>
@@ -845,7 +879,7 @@
               <w:rPr>
                 <w:noProof/>
               </w:rPr>
-              <w:instrText xml:space="preserve"> PAGEREF _Toc235835476 \h </w:instrText>
+              <w:instrText xml:space="preserve"> PAGEREF _Toc235990766 \h </w:instrText>
             </w:r>
             <w:r>
               <w:rPr>
@@ -885,7 +919,7 @@
               <w:szCs w:val="22"/>
             </w:rPr>
           </w:pPr>
-          <w:hyperlink w:anchor="_Toc235835477" w:history="1">
+          <w:hyperlink w:anchor="_Toc235990767" w:history="1">
             <w:r>
               <w:rPr>
                 <w:rStyle w:val="Hyperlink"/>
@@ -909,7 +943,7 @@
               <w:rPr>
                 <w:noProof/>
               </w:rPr>
-              <w:instrText xml:space="preserve"> PAGEREF _Toc235835477 \h </w:instrText>
+              <w:instrText xml:space="preserve"> PAGEREF _Toc235990767 \h </w:instrText>
             </w:r>
             <w:r>
               <w:rPr>
@@ -949,7 +983,7 @@
               <w:szCs w:val="22"/>
             </w:rPr>
           </w:pPr>
-          <w:hyperlink w:anchor="_Toc235835478" w:history="1">
+          <w:hyperlink w:anchor="_Toc235990768" w:history="1">
             <w:r>
               <w:rPr>
                 <w:rStyle w:val="Hyperlink"/>
@@ -973,7 +1007,7 @@
               <w:rPr>
                 <w:noProof/>
               </w:rPr>
-              <w:instrText xml:space="preserve"> PAGEREF _Toc235835478 \h </w:instrText>
+              <w:instrText xml:space="preserve"> PAGEREF _Toc235990768 \h </w:instrText>
             </w:r>
             <w:r>
               <w:rPr>
@@ -1013,7 +1047,7 @@
               <w:szCs w:val="22"/>
             </w:rPr>
           </w:pPr>
-          <w:hyperlink w:anchor="_Toc235835479" w:history="1">
+          <w:hyperlink w:anchor="_Toc235990769" w:history="1">
             <w:r>
               <w:rPr>
                 <w:rStyle w:val="Hyperlink"/>
@@ -1037,7 +1071,7 @@
               <w:rPr>
                 <w:noProof/>
               </w:rPr>
-              <w:instrText xml:space="preserve"> PAGEREF _Toc235835479 \h </w:instrText>
+              <w:instrText xml:space="preserve"> PAGEREF _Toc235990769 \h </w:instrText>
             </w:r>
             <w:r>
               <w:rPr>
@@ -1077,7 +1111,7 @@
               <w:szCs w:val="22"/>
             </w:rPr>
           </w:pPr>
-          <w:hyperlink w:anchor="_Toc235835480" w:history="1">
+          <w:hyperlink w:anchor="_Toc235990770" w:history="1">
             <w:r>
               <w:rPr>
                 <w:rStyle w:val="Hyperlink"/>
@@ -1101,7 +1135,7 @@
               <w:rPr>
                 <w:noProof/>
               </w:rPr>
-              <w:instrText xml:space="preserve"> PAGEREF _Toc235835480 \h </w:instrText>
+              <w:instrText xml:space="preserve"> PAGEREF _Toc235990770 \h </w:instrText>
             </w:r>
             <w:r>
               <w:rPr>
@@ -1141,7 +1175,7 @@
               <w:szCs w:val="22"/>
             </w:rPr>
           </w:pPr>
-          <w:hyperlink w:anchor="_Toc235835481" w:history="1">
+          <w:hyperlink w:anchor="_Toc235990771" w:history="1">
             <w:r>
               <w:rPr>
                 <w:rStyle w:val="Hyperlink"/>
@@ -1165,7 +1199,7 @@
               <w:rPr>
                 <w:noProof/>
               </w:rPr>
-              <w:instrText xml:space="preserve"> PAGEREF _Toc235835481 \h </w:instrText>
+              <w:instrText xml:space="preserve"> PAGEREF _Toc235990771 \h </w:instrText>
             </w:r>
             <w:r>
               <w:rPr>
@@ -1205,7 +1239,7 @@
               <w:szCs w:val="22"/>
             </w:rPr>
           </w:pPr>
-          <w:hyperlink w:anchor="_Toc235835482" w:history="1">
+          <w:hyperlink w:anchor="_Toc235990772" w:history="1">
             <w:r>
               <w:rPr>
                 <w:rStyle w:val="Hyperlink"/>
@@ -1229,7 +1263,7 @@
               <w:rPr>
                 <w:noProof/>
               </w:rPr>
-              <w:instrText xml:space="preserve"> PAGEREF _Toc235835482 \h </w:instrText>
+              <w:instrText xml:space="preserve"> PAGEREF _Toc235990772 \h </w:instrText>
             </w:r>
             <w:r>
               <w:rPr>
@@ -1269,7 +1303,7 @@
               <w:szCs w:val="22"/>
             </w:rPr>
           </w:pPr>
-          <w:hyperlink w:anchor="_Toc235835483" w:history="1">
+          <w:hyperlink w:anchor="_Toc235990773" w:history="1">
             <w:r>
               <w:rPr>
                 <w:rStyle w:val="Hyperlink"/>
@@ -1293,7 +1327,7 @@
               <w:rPr>
                 <w:noProof/>
               </w:rPr>
-              <w:instrText xml:space="preserve"> PAGEREF _Toc235835483 \h </w:instrText>
+              <w:instrText xml:space="preserve"> PAGEREF _Toc235990773 \h </w:instrText>
             </w:r>
             <w:r>
               <w:rPr>
@@ -1333,7 +1367,7 @@
               <w:szCs w:val="22"/>
             </w:rPr>
           </w:pPr>
-          <w:hyperlink w:anchor="_Toc235835484" w:history="1">
+          <w:hyperlink w:anchor="_Toc235990774" w:history="1">
             <w:r>
               <w:rPr>
                 <w:rStyle w:val="Hyperlink"/>
@@ -1358,7 +1392,7 @@
               <w:rPr>
                 <w:noProof/>
               </w:rPr>
-              <w:instrText xml:space="preserve"> PAGEREF _Toc235835484 \h </w:instrText>
+              <w:instrText xml:space="preserve"> PAGEREF _Toc235990774 \h </w:instrText>
             </w:r>
             <w:r>
               <w:rPr>
@@ -1398,7 +1432,7 @@
               <w:szCs w:val="22"/>
             </w:rPr>
           </w:pPr>
-          <w:hyperlink w:anchor="_Toc235835485" w:history="1">
+          <w:hyperlink w:anchor="_Toc235990775" w:history="1">
             <w:r>
               <w:rPr>
                 <w:rStyle w:val="Hyperlink"/>
@@ -1422,7 +1456,7 @@
               <w:rPr>
                 <w:noProof/>
               </w:rPr>
-              <w:instrText xml:space="preserve"> PAGEREF _Toc235835485 \h </w:instrText>
+              <w:instrText xml:space="preserve"> PAGEREF _Toc235990775 \h </w:instrText>
             </w:r>
             <w:r>
               <w:rPr>
@@ -1462,7 +1496,7 @@
               <w:szCs w:val="22"/>
             </w:rPr>
           </w:pPr>
-          <w:hyperlink w:anchor="_Toc235835486" w:history="1">
+          <w:hyperlink w:anchor="_Toc235990776" w:history="1">
             <w:r>
               <w:rPr>
                 <w:rStyle w:val="Hyperlink"/>
@@ -1486,7 +1520,7 @@
               <w:rPr>
                 <w:noProof/>
               </w:rPr>
-              <w:instrText xml:space="preserve"> PAGEREF _Toc235835486 \h </w:instrText>
+              <w:instrText xml:space="preserve"> PAGEREF _Toc235990776 \h </w:instrText>
             </w:r>
             <w:r>
               <w:rPr>
@@ -1526,7 +1560,7 @@
               <w:szCs w:val="22"/>
             </w:rPr>
           </w:pPr>
-          <w:hyperlink w:anchor="_Toc235835487" w:history="1">
+          <w:hyperlink w:anchor="_Toc235990777" w:history="1">
             <w:r>
               <w:rPr>
                 <w:rStyle w:val="Hyperlink"/>
@@ -1550,7 +1584,7 @@
               <w:rPr>
                 <w:noProof/>
               </w:rPr>
-              <w:instrText xml:space="preserve"> PAGEREF _Toc235835487 \h </w:instrText>
+              <w:instrText xml:space="preserve"> PAGEREF _Toc235990777 \h </w:instrText>
             </w:r>
             <w:r>
               <w:rPr>
@@ -1590,7 +1624,7 @@
               <w:szCs w:val="22"/>
             </w:rPr>
           </w:pPr>
-          <w:hyperlink w:anchor="_Toc235835488" w:history="1">
+          <w:hyperlink w:anchor="_Toc235990778" w:history="1">
             <w:r>
               <w:rPr>
                 <w:rStyle w:val="Hyperlink"/>
@@ -1614,7 +1648,7 @@
               <w:rPr>
                 <w:noProof/>
               </w:rPr>
-              <w:instrText xml:space="preserve"> PAGEREF _Toc235835488 \h </w:instrText>
+              <w:instrText xml:space="preserve"> PAGEREF _Toc235990778 \h </w:instrText>
             </w:r>
             <w:r>
               <w:rPr>
@@ -1654,7 +1688,7 @@
               <w:szCs w:val="22"/>
             </w:rPr>
           </w:pPr>
-          <w:hyperlink w:anchor="_Toc235835489" w:history="1">
+          <w:hyperlink w:anchor="_Toc235990779" w:history="1">
             <w:r>
               <w:rPr>
                 <w:rStyle w:val="Hyperlink"/>
@@ -1678,7 +1712,7 @@
               <w:rPr>
                 <w:noProof/>
               </w:rPr>
-              <w:instrText xml:space="preserve"> PAGEREF _Toc235835489 \h </w:instrText>
+              <w:instrText xml:space="preserve"> PAGEREF _Toc235990779 \h </w:instrText>
             </w:r>
             <w:r>
               <w:rPr>
@@ -1718,7 +1752,7 @@
               <w:szCs w:val="22"/>
             </w:rPr>
           </w:pPr>
-          <w:hyperlink w:anchor="_Toc235835490" w:history="1">
+          <w:hyperlink w:anchor="_Toc235990780" w:history="1">
             <w:r>
               <w:rPr>
                 <w:rStyle w:val="Hyperlink"/>
@@ -1742,7 +1776,7 @@
               <w:rPr>
                 <w:noProof/>
               </w:rPr>
-              <w:instrText xml:space="preserve"> PAGEREF _Toc235835490 \h </w:instrText>
+              <w:instrText xml:space="preserve"> PAGEREF _Toc235990780 \h </w:instrText>
             </w:r>
             <w:r>
               <w:rPr>
@@ -1782,7 +1816,7 @@
               <w:szCs w:val="22"/>
             </w:rPr>
           </w:pPr>
-          <w:hyperlink w:anchor="_Toc235835491" w:history="1">
+          <w:hyperlink w:anchor="_Toc235990781" w:history="1">
             <w:r>
               <w:rPr>
                 <w:rStyle w:val="Hyperlink"/>
@@ -1806,7 +1840,7 @@
               <w:rPr>
                 <w:noProof/>
               </w:rPr>
-              <w:instrText xml:space="preserve"> PAGEREF _Toc235835491 \h </w:instrText>
+              <w:instrText xml:space="preserve"> PAGEREF _Toc235990781 \h </w:instrText>
             </w:r>
             <w:r>
               <w:rPr>
@@ -1846,7 +1880,7 @@
               <w:szCs w:val="22"/>
             </w:rPr>
           </w:pPr>
-          <w:hyperlink w:anchor="_Toc235835492" w:history="1">
+          <w:hyperlink w:anchor="_Toc235990782" w:history="1">
             <w:r>
               <w:rPr>
                 <w:rStyle w:val="Hyperlink"/>
@@ -1870,7 +1904,7 @@
               <w:rPr>
                 <w:noProof/>
               </w:rPr>
-              <w:instrText xml:space="preserve"> PAGEREF _Toc235835492 \h </w:instrText>
+              <w:instrText xml:space="preserve"> PAGEREF _Toc235990782 \h </w:instrText>
             </w:r>
             <w:r>
               <w:rPr>
@@ -1910,7 +1944,7 @@
               <w:szCs w:val="22"/>
             </w:rPr>
           </w:pPr>
-          <w:hyperlink w:anchor="_Toc235835493" w:history="1">
+          <w:hyperlink w:anchor="_Toc235990783" w:history="1">
             <w:r>
               <w:rPr>
                 <w:rStyle w:val="Hyperlink"/>
@@ -1934,7 +1968,7 @@
               <w:rPr>
                 <w:noProof/>
               </w:rPr>
-              <w:instrText xml:space="preserve"> PAGEREF _Toc235835493 \h </w:instrText>
+              <w:instrText xml:space="preserve"> PAGEREF _Toc235990783 \h </w:instrText>
             </w:r>
             <w:r>
               <w:rPr>
@@ -1974,7 +2008,7 @@
               <w:szCs w:val="22"/>
             </w:rPr>
           </w:pPr>
-          <w:hyperlink w:anchor="_Toc235835494" w:history="1">
+          <w:hyperlink w:anchor="_Toc235990784" w:history="1">
             <w:r>
               <w:rPr>
                 <w:rStyle w:val="Hyperlink"/>
@@ -1998,7 +2032,7 @@
               <w:rPr>
                 <w:noProof/>
               </w:rPr>
-              <w:instrText xml:space="preserve"> PAGEREF _Toc235835494 \h </w:instrText>
+              <w:instrText xml:space="preserve"> PAGEREF _Toc235990784 \h </w:instrText>
             </w:r>
             <w:r>
               <w:rPr>
@@ -2038,7 +2072,7 @@
               <w:szCs w:val="22"/>
             </w:rPr>
           </w:pPr>
-          <w:hyperlink w:anchor="_Toc235835495" w:history="1">
+          <w:hyperlink w:anchor="_Toc235990785" w:history="1">
             <w:r>
               <w:rPr>
                 <w:rStyle w:val="Hyperlink"/>
@@ -2062,7 +2096,7 @@
               <w:rPr>
                 <w:noProof/>
               </w:rPr>
-              <w:instrText xml:space="preserve"> PAGEREF _Toc235835495 \h </w:instrText>
+              <w:instrText xml:space="preserve"> PAGEREF _Toc235990785 \h </w:instrText>
             </w:r>
             <w:r>
               <w:rPr>
@@ -2102,7 +2136,7 @@
               <w:szCs w:val="22"/>
             </w:rPr>
           </w:pPr>
-          <w:hyperlink w:anchor="_Toc235835496" w:history="1">
+          <w:hyperlink w:anchor="_Toc235990786" w:history="1">
             <w:r>
               <w:rPr>
                 <w:rStyle w:val="Hyperlink"/>
@@ -2126,7 +2160,7 @@
               <w:rPr>
                 <w:noProof/>
               </w:rPr>
-              <w:instrText xml:space="preserve"> PAGEREF _Toc235835496 \h </w:instrText>
+              <w:instrText xml:space="preserve"> PAGEREF _Toc235990786 \h </w:instrText>
             </w:r>
             <w:r>
               <w:rPr>
@@ -2166,7 +2200,7 @@
               <w:szCs w:val="22"/>
             </w:rPr>
           </w:pPr>
-          <w:hyperlink w:anchor="_Toc235835497" w:history="1">
+          <w:hyperlink w:anchor="_Toc235990787" w:history="1">
             <w:r>
               <w:rPr>
                 <w:rStyle w:val="Hyperlink"/>
@@ -2190,7 +2224,7 @@
               <w:rPr>
                 <w:noProof/>
               </w:rPr>
-              <w:instrText xml:space="preserve"> PAGEREF _Toc235835497 \h </w:instrText>
+              <w:instrText xml:space="preserve"> PAGEREF _Toc235990787 \h </w:instrText>
             </w:r>
             <w:r>
               <w:rPr>
@@ -2230,7 +2264,7 @@
               <w:szCs w:val="22"/>
             </w:rPr>
           </w:pPr>
-          <w:hyperlink w:anchor="_Toc235835498" w:history="1">
+          <w:hyperlink w:anchor="_Toc235990788" w:history="1">
             <w:r>
               <w:rPr>
                 <w:rStyle w:val="Hyperlink"/>
@@ -2254,7 +2288,7 @@
               <w:rPr>
                 <w:noProof/>
               </w:rPr>
-              <w:instrText xml:space="preserve"> PAGEREF _Toc235835498 \h </w:instrText>
+              <w:instrText xml:space="preserve"> PAGEREF _Toc235990788 \h </w:instrText>
             </w:r>
             <w:r>
               <w:rPr>
@@ -2294,7 +2328,7 @@
               <w:szCs w:val="22"/>
             </w:rPr>
           </w:pPr>
-          <w:hyperlink w:anchor="_Toc235835499" w:history="1">
+          <w:hyperlink w:anchor="_Toc235990789" w:history="1">
             <w:r>
               <w:rPr>
                 <w:rStyle w:val="Hyperlink"/>
@@ -2318,7 +2352,7 @@
               <w:rPr>
                 <w:noProof/>
               </w:rPr>
-              <w:instrText xml:space="preserve"> PAGEREF _Toc235835499 \h </w:instrText>
+              <w:instrText xml:space="preserve"> PAGEREF _Toc235990789 \h </w:instrText>
             </w:r>
             <w:r>
               <w:rPr>
@@ -2358,7 +2392,7 @@
               <w:szCs w:val="22"/>
             </w:rPr>
           </w:pPr>
-          <w:hyperlink w:anchor="_Toc235835500" w:history="1">
+          <w:hyperlink w:anchor="_Toc235990790" w:history="1">
             <w:r>
               <w:rPr>
                 <w:rStyle w:val="Hyperlink"/>
@@ -2382,7 +2416,7 @@
               <w:rPr>
                 <w:noProof/>
               </w:rPr>
-              <w:instrText xml:space="preserve"> PAGEREF _Toc235835500 \h </w:instrText>
+              <w:instrText xml:space="preserve"> PAGEREF _Toc235990790 \h </w:instrText>
             </w:r>
             <w:r>
               <w:rPr>
@@ -2422,7 +2456,7 @@
               <w:szCs w:val="22"/>
             </w:rPr>
           </w:pPr>
-          <w:hyperlink w:anchor="_Toc235835501" w:history="1">
+          <w:hyperlink w:anchor="_Toc235990791" w:history="1">
             <w:r>
               <w:rPr>
                 <w:rStyle w:val="Hyperlink"/>
@@ -2446,7 +2480,7 @@
               <w:rPr>
                 <w:noProof/>
               </w:rPr>
-              <w:instrText xml:space="preserve"> PAGEREF _Toc235835501 \h </w:instrText>
+              <w:instrText xml:space="preserve"> PAGEREF _Toc235990791 \h </w:instrText>
             </w:r>
             <w:r>
               <w:rPr>
@@ -2486,7 +2520,7 @@
               <w:szCs w:val="22"/>
             </w:rPr>
           </w:pPr>
-          <w:hyperlink w:anchor="_Toc235835502" w:history="1">
+          <w:hyperlink w:anchor="_Toc235990792" w:history="1">
             <w:r>
               <w:rPr>
                 <w:rStyle w:val="Hyperlink"/>
@@ -2510,7 +2544,7 @@
               <w:rPr>
                 <w:noProof/>
               </w:rPr>
-              <w:instrText xml:space="preserve"> PAGEREF _Toc235835502 \h </w:instrText>
+              <w:instrText xml:space="preserve"> PAGEREF _Toc235990792 \h </w:instrText>
             </w:r>
             <w:r>
               <w:rPr>
@@ -2550,7 +2584,7 @@
               <w:szCs w:val="22"/>
             </w:rPr>
           </w:pPr>
-          <w:hyperlink w:anchor="_Toc235835503" w:history="1">
+          <w:hyperlink w:anchor="_Toc235990793" w:history="1">
             <w:r>
               <w:rPr>
                 <w:rStyle w:val="Hyperlink"/>
@@ -2574,7 +2608,7 @@
               <w:rPr>
                 <w:noProof/>
               </w:rPr>
-              <w:instrText xml:space="preserve"> PAGEREF _Toc235835503 \h </w:instrText>
+              <w:instrText xml:space="preserve"> PAGEREF _Toc235990793 \h </w:instrText>
             </w:r>
             <w:r>
               <w:rPr>
@@ -2614,7 +2648,7 @@
               <w:szCs w:val="22"/>
             </w:rPr>
           </w:pPr>
-          <w:hyperlink w:anchor="_Toc235835504" w:history="1">
+          <w:hyperlink w:anchor="_Toc235990794" w:history="1">
             <w:r>
               <w:rPr>
                 <w:rStyle w:val="Hyperlink"/>
@@ -2638,7 +2672,7 @@
               <w:rPr>
                 <w:noProof/>
               </w:rPr>
-              <w:instrText xml:space="preserve"> PAGEREF _Toc235835504 \h </w:instrText>
+              <w:instrText xml:space="preserve"> PAGEREF _Toc235990794 \h </w:instrText>
             </w:r>
             <w:r>
               <w:rPr>
@@ -2678,7 +2712,7 @@
               <w:szCs w:val="22"/>
             </w:rPr>
           </w:pPr>
-          <w:hyperlink w:anchor="_Toc235835505" w:history="1">
+          <w:hyperlink w:anchor="_Toc235990795" w:history="1">
             <w:r>
               <w:rPr>
                 <w:rStyle w:val="Hyperlink"/>
@@ -2702,7 +2736,7 @@
               <w:rPr>
                 <w:noProof/>
               </w:rPr>
-              <w:instrText xml:space="preserve"> PAGEREF _Toc235835505 \h </w:instrText>
+              <w:instrText xml:space="preserve"> PAGEREF _Toc235990795 \h </w:instrText>
             </w:r>
             <w:r>
               <w:rPr>
@@ -2742,7 +2776,7 @@
               <w:szCs w:val="22"/>
             </w:rPr>
           </w:pPr>
-          <w:hyperlink w:anchor="_Toc235835506" w:history="1">
+          <w:hyperlink w:anchor="_Toc235990796" w:history="1">
             <w:r>
               <w:rPr>
                 <w:rStyle w:val="Hyperlink"/>
@@ -2766,7 +2800,7 @@
               <w:rPr>
                 <w:noProof/>
               </w:rPr>
-              <w:instrText xml:space="preserve"> PAGEREF _Toc235835506 \h </w:instrText>
+              <w:instrText xml:space="preserve"> PAGEREF _Toc235990796 \h </w:instrText>
             </w:r>
             <w:r>
               <w:rPr>
@@ -2806,7 +2840,7 @@
               <w:szCs w:val="22"/>
             </w:rPr>
           </w:pPr>
-          <w:hyperlink w:anchor="_Toc235835507" w:history="1">
+          <w:hyperlink w:anchor="_Toc235990797" w:history="1">
             <w:r>
               <w:rPr>
                 <w:rStyle w:val="Hyperlink"/>
@@ -2830,7 +2864,7 @@
               <w:rPr>
                 <w:noProof/>
               </w:rPr>
-              <w:instrText xml:space="preserve"> PAGEREF _Toc235835507 \h </w:instrText>
+              <w:instrText xml:space="preserve"> PAGEREF _Toc235990797 \h </w:instrText>
             </w:r>
             <w:r>
               <w:rPr>
@@ -2870,7 +2904,7 @@
               <w:szCs w:val="22"/>
             </w:rPr>
           </w:pPr>
-          <w:hyperlink w:anchor="_Toc235835508" w:history="1">
+          <w:hyperlink w:anchor="_Toc235990798" w:history="1">
             <w:r>
               <w:rPr>
                 <w:rStyle w:val="Hyperlink"/>
@@ -2895,7 +2929,7 @@
               <w:rPr>
                 <w:noProof/>
               </w:rPr>
-              <w:instrText xml:space="preserve"> PAGEREF _Toc235835508 \h </w:instrText>
+              <w:instrText xml:space="preserve"> PAGEREF _Toc235990798 \h </w:instrText>
             </w:r>
             <w:r>
               <w:rPr>
@@ -2935,13 +2969,27 @@
               <w:szCs w:val="22"/>
             </w:rPr>
           </w:pPr>
-          <w:hyperlink w:anchor="_Toc235835509" w:history="1">
+          <w:hyperlink w:anchor="_Toc235990799" w:history="1">
             <w:r>
               <w:rPr>
                 <w:rStyle w:val="Hyperlink"/>
                 <w:noProof/>
               </w:rPr>
-              <w:t>Datenquellen</w:t>
+              <w:t>Datenq</w:t>
+            </w:r>
+            <w:r>
+              <w:rPr>
+                <w:rStyle w:val="Hyperlink"/>
+                <w:noProof/>
+              </w:rPr>
+              <w:t>u</w:t>
+            </w:r>
+            <w:r>
+              <w:rPr>
+                <w:rStyle w:val="Hyperlink"/>
+                <w:noProof/>
+              </w:rPr>
+              <w:t>ellen</w:t>
             </w:r>
             <w:r>
               <w:rPr>
@@ -2959,7 +3007,72 @@
               <w:rPr>
                 <w:noProof/>
               </w:rPr>
-              <w:instrText xml:space="preserve"> PAGEREF _Toc235835509 \h </w:instrText>
+              <w:instrText xml:space="preserve"> PAGEREF _Toc235990799 \h </w:instrText>
+            </w:r>
+            <w:r>
+              <w:rPr>
+                <w:noProof/>
+              </w:rPr>
+            </w:r>
+            <w:r>
+              <w:rPr>
+                <w:noProof/>
+              </w:rPr>
+              <w:fldChar w:fldCharType="separate"/>
+            </w:r>
+            <w:r>
+              <w:rPr>
+                <w:noProof/>
+              </w:rPr>
+              <w:t>43</w:t>
+            </w:r>
+            <w:r>
+              <w:rPr>
+                <w:noProof/>
+              </w:rPr>
+              <w:fldChar w:fldCharType="end"/>
+            </w:r>
+          </w:hyperlink>
+        </w:p>
+        <w:p>
+          <w:pPr>
+            <w:pStyle w:val="TOC1"/>
+            <w:tabs>
+              <w:tab w:val="right" w:leader="dot" w:pos="9016"/>
+            </w:tabs>
+            <w:rPr>
+              <w:rFonts w:asciiTheme="minorHAnsi" w:eastAsiaTheme="minorEastAsia" w:hAnsiTheme="minorHAnsi" w:cstheme="minorBidi"/>
+              <w:noProof/>
+              <w:sz w:val="22"/>
+              <w:szCs w:val="22"/>
+            </w:rPr>
+          </w:pPr>
+          <w:hyperlink w:anchor="_Toc235990800" w:history="1">
+            <w:r>
+              <w:rPr>
+                <w:rStyle w:val="Hyperlink"/>
+                <w:noProof/>
+                <w:lang w:val="en-US"/>
+              </w:rPr>
+              <w:t>Codequellen</w:t>
+            </w:r>
+            <w:r>
+              <w:rPr>
+                <w:noProof/>
+              </w:rPr>
+              <w:tab/>
+            </w:r>
+            <w:r>
+              <w:rPr>
+                <w:noProof/>
+              </w:rPr>
+              <w:fldChar w:fldCharType="begin"/>
+            </w:r>
+            <w:r>
+              <w:rPr>
+                <w:noProof/>
+              </w:rPr>
+              <w:instrText xml:space="preserve"> PAGEREF _Toc235990800 \h </w:instrText>
             </w:r>
             <w:r>
               <w:rPr>
@@ -3007,22 +3120,22 @@
       <w:pPr>
         <w:pStyle w:val="Heading1"/>
       </w:pPr>
-      <w:bookmarkStart w:id="1" w:name="_Toc235835467"/>
+      <w:bookmarkStart w:id="0" w:name="_Toc235990757"/>
       <w:r>
         <w:lastRenderedPageBreak/>
         <w:t>Kapitel 1: Einleitung</w:t>
       </w:r>
+      <w:bookmarkEnd w:id="0"/>
+    </w:p>
+    <w:p>
+      <w:pPr>
+        <w:pStyle w:val="Heading2"/>
+      </w:pPr>
+      <w:bookmarkStart w:id="1" w:name="_Toc235990758"/>
+      <w:r>
+        <w:t>1.1 Motivation</w:t>
+      </w:r>
       <w:bookmarkEnd w:id="1"/>
-    </w:p>
-    <w:p>
-      <w:pPr>
-        <w:pStyle w:val="Heading2"/>
-      </w:pPr>
-      <w:bookmarkStart w:id="2" w:name="_Toc235835468"/>
-      <w:r>
-        <w:t>1.1 Motivation</w:t>
-      </w:r>
-      <w:bookmarkEnd w:id="2"/>
     </w:p>
     <w:p>
       <w:pPr>
@@ -3045,7 +3158,10 @@
         <w:t>European Commission</w:t>
       </w:r>
       <w:r>
-        <w:t>, 2021). Die damit verbundene Erwartung, dass eine weiter fortgeschrittene Digitalisierung mit einer höheren wirtschaftlichen Leistungsfähigkeit einhergeht, ist politisch bedeutsam, empirisch jedoch nicht eindeutig bestätigt. Während Czernich et al. (2011) einen positiven kausalen Effekt der Breitbanddurchdringung auf das Wirtschaftswachstum berichten, zeigen andere Arbeiten, dass die bloße Verfügbarkeit digitaler Technologien nicht automatisch zu wirtschaftlichen Erträgen führt. Von Bedeutung sind vielmehr auch die tatsächliche Nutzung sowie komplementäre Voraussetzungen wie Humankapital, Fähigkeiten und organisatorische Kapazitäten (Evangelista et al., 2014; Gal et al., 2019; Mack &amp; Faggian, 2013; Briglauer et al., 2025).</w:t>
+        <w:t xml:space="preserve">, 2021). Die damit verbundene Erwartung, dass eine weiter fortgeschrittene Digitalisierung mit einer höheren wirtschaftlichen Leistungsfähigkeit einhergeht, ist politisch bedeutsam, empirisch jedoch nicht eindeutig bestätigt. </w:t>
+      </w:r>
+      <w:r>
+        <w:t>Während Czernich et al. (2011) einen positiven kausalen Effekt der Breitbanddurchdringung auf das Wirtschaftswachstum berichten, zeigen andere Arbeiten, dass die bloße Verfügbarkeit digitaler Technologien nicht automatisch mit wirtschaftlichen Erträgen verbunden ist (Evangelista et al., 2014; Gal et al., 2019; Mack &amp; Faggian, 2013; Briglauer et al., 2025). Von Bedeutung sind vielmehr auch die tatsächliche Nutzung sowie komplementäre Voraussetzungen wie Humankapital, Fähigkeiten und organisatorische Kapazitäten.</w:t>
       </w:r>
     </w:p>
     <w:p>
@@ -3065,11 +3181,11 @@
       <w:pPr>
         <w:pStyle w:val="Heading2"/>
       </w:pPr>
-      <w:bookmarkStart w:id="3" w:name="_Toc235835469"/>
+      <w:bookmarkStart w:id="2" w:name="_Toc235990759"/>
       <w:r>
         <w:t>1.2 Problemstellung</w:t>
       </w:r>
-      <w:bookmarkEnd w:id="3"/>
+      <w:bookmarkEnd w:id="2"/>
     </w:p>
     <w:p>
       <w:pPr>
@@ -3086,7 +3202,13 @@
         <w:jc w:val="both"/>
       </w:pPr>
       <w:r>
-        <w:t>Zweitens schätzt ein großer Teil der Literatur durchschnittliche Zusammenhänge zwischen Digitalisierung und wirtschaftlicher Leistung, ohne ausdrücklich zu untersuchen, ob diese Zusammenhänge vom Bildungsniveau oder anderen komplementären Voraussetzungen abhängen. Auch im breiteren Forschungsfeld zum digitalen Graben werden Moderatoren und Mediatoren vergleichsweise selten berücksichtigt; Lythreatis et al. (2022) identifizieren entsprechende Ansätze lediglich in fünf der 50 von ihnen untersuchten Studien. Theoretische Überlegungen sowie mikroökonometrische, regionale und unternehmensbezogene Evidenz legen jedoch nahe, dass die Verbreitung, Nutzung und wirtschaftliche Bedeutung digitaler Technologien mit Bildung, Qualifikation und weiteren komplementären Fähigkeiten zusammenhängen (Bresnahan et al., 2002; Akerman et al., 2015; Mack &amp; Faggian, 2013; Gal et al., 2019; Lythreatis et al., 2022). Die vorliegende Arbeit untersucht deshalb explorativ, ob der Zusammenhang zwischen digitaler Adoption und wirtschaftlicher Leistungsfähigkeit durch das Bildungsniveau moderiert wird.</w:t>
+        <w:t>Zweitens schätzt ein großer Teil der Literatur durchschnittliche Zusammenhänge zwischen Digitalisierung und wirtschaftlicher Leistung, ohne ausdrücklich zu untersuchen, ob diese Zusammenhänge vom Bildungsniveau oder anderen komplementären Voraussetzungen abhängen. Auch im breiteren Forschungsfeld zum digitalen Graben werden Moderatoren und Mediatoren vergle</w:t>
+      </w:r>
+      <w:r>
+        <w:t>ichsweise selten berücksichtigt.</w:t>
+      </w:r>
+      <w:r>
+        <w:t xml:space="preserve"> Lythreatis et al. (2022) identifizieren entsprechende Ansätze lediglich in fünf der 50 von ihnen untersuchten Studien. Theoretische Überlegungen sowie mikroökonometrische, regionale und unternehmensbezogene Evidenz legen jedoch nahe, dass die Verbreitung, Nutzung und wirtschaftliche Bedeutung digitaler Technologien mit Bildung, Qualifikation und weiteren komplementären Fähigkeiten zusammenhängen (Bresnahan et al., 2002; Akerman et al., 2015; Mack &amp; Faggian, 2013; Gal et al., 2019; Lythreatis et al., 2022). Die vorliegende Arbeit untersucht deshalb explorativ, ob der Zusammenhang zwischen digitaler Adoption und wirtschaftlicher Leistungsfähigkeit durch das Bildungsniveau moderiert wird.</w:t>
       </w:r>
     </w:p>
     <w:p>
@@ -3108,18 +3230,24 @@
         <w:jc w:val="both"/>
       </w:pPr>
       <w:r>
-        <w:t>Unter einem digitalen und innovationsbezogenen Länderprofil wird in dieser Arbeit die gemeinsame Ausprägung der ausgewählten Indikatoren zu Internetzugang, Internetnutzung, Cloud-Nutzung, Festnetzbreitband, sicheren Internetservern, Hochtechnologieexporten sowie Forschungs- und Entwicklungsausgaben verstanden.</w:t>
+        <w:t>Unter einem digitalen und innovationsbezogenen Länderprofil wird in dieser Arbeit die gemeinsame Ausprägung der ausgewählten Indikatoren zu Internetzugang, Internetnutzung, Cloud-Nutzung, Festnetzbreitband, sicheren Internetservern, Hochtechnologieexporten sowie Forschungs- und Entwicklungsausgaben</w:t>
+      </w:r>
+      <w:r>
+        <w:t xml:space="preserve"> (F&amp;E-Ausgaben)</w:t>
+      </w:r>
+      <w:r>
+        <w:t xml:space="preserve"> verstanden.</w:t>
       </w:r>
     </w:p>
     <w:p>
       <w:pPr>
         <w:pStyle w:val="Heading2"/>
       </w:pPr>
-      <w:bookmarkStart w:id="4" w:name="_Toc235835470"/>
+      <w:bookmarkStart w:id="3" w:name="_Toc235990760"/>
       <w:r>
         <w:t>1.3 Forschungsfrage und Relevanz</w:t>
       </w:r>
-      <w:bookmarkEnd w:id="4"/>
+      <w:bookmarkEnd w:id="3"/>
     </w:p>
     <w:p>
       <w:pPr>
@@ -3192,11 +3320,11 @@
       <w:pPr>
         <w:pStyle w:val="Heading2"/>
       </w:pPr>
-      <w:bookmarkStart w:id="5" w:name="_Toc235835471"/>
+      <w:bookmarkStart w:id="4" w:name="_Toc235990761"/>
       <w:r>
         <w:t>1.4 Untersuchungsgegenstand und Abgrenzung</w:t>
       </w:r>
-      <w:bookmarkEnd w:id="5"/>
+      <w:bookmarkEnd w:id="4"/>
     </w:p>
     <w:p>
       <w:pPr>
@@ -3226,7 +3354,10 @@
         <w:jc w:val="both"/>
       </w:pPr>
       <w:r>
-        <w:t>Der gewählte Zeitraum 2017 bis 2024 bildet eine aktuelle Phase der digitalen Entwicklung ab und ermöglicht zugleich ein ausbalanciertes Panel mit acht Beobachtungsjahren. Er umfasst mit den Jahren 2020 und 2021 jedoch auch eine außergewöhnliche wirtschaftliche und gesellschaftliche Situation. Die COVID-19-Pandemie kann sowohl die wirtschaftliche Leistungsfähigkeit als auch die Nutzung digitaler Technologien beeinflusst haben. Da die Mitgliedstaaten unterschiedlich stark betroffen waren und unterschiedliche gesundheits- und wirtschaftspolitische Maßnahmen ergriffen, sind länderspezifische Abweichungen von der allgemeinen zeitlichen Entwicklung möglich. Jahresspezifische feste Effekte erfassen gemeinsame zeitliche Veränderungen, können heterogene länderspezifische Pandemieauswirkungen jedoch nur begrenzt berücksichtigen. Dieser Umstand wird in Abschnitt 5.4 als Limitation der Untersuchung diskutiert.</w:t>
+        <w:t>Der gewählte Zeitraum 2017 bis 2024 bildet eine aktuelle Phase der digitalen Entwicklung ab und ermöglicht zugleich ein ausbalanciertes Panel mit acht Beobachtungsjahr</w:t>
+      </w:r>
+      <w:r>
+        <w:t>en.</w:t>
       </w:r>
     </w:p>
     <w:p>
@@ -3248,11 +3379,11 @@
       <w:pPr>
         <w:pStyle w:val="Heading2"/>
       </w:pPr>
-      <w:bookmarkStart w:id="6" w:name="_Toc235835472"/>
+      <w:bookmarkStart w:id="5" w:name="_Toc235990762"/>
       <w:r>
         <w:t>1.5 Aufbau der Arbeit</w:t>
       </w:r>
-      <w:bookmarkEnd w:id="6"/>
+      <w:bookmarkEnd w:id="5"/>
     </w:p>
     <w:p>
       <w:pPr>
@@ -3270,12 +3401,12 @@
       <w:r>
         <w:br w:type="page"/>
       </w:r>
-      <w:bookmarkStart w:id="7" w:name="_Toc235835473"/>
+      <w:bookmarkStart w:id="6" w:name="_Toc235990763"/>
       <w:r>
         <w:lastRenderedPageBreak/>
         <w:t>Kapitel 2: Theoretischer Rahmen und Forschungsstand</w:t>
       </w:r>
-      <w:bookmarkEnd w:id="7"/>
+      <w:bookmarkEnd w:id="6"/>
     </w:p>
     <w:p>
       <w:pPr>
@@ -3290,11 +3421,11 @@
       <w:pPr>
         <w:pStyle w:val="Heading2"/>
       </w:pPr>
-      <w:bookmarkStart w:id="8" w:name="_Toc235835474"/>
+      <w:bookmarkStart w:id="7" w:name="_Toc235990764"/>
       <w:r>
         <w:t>2.1 Digitalisierung als General Purpose Technology</w:t>
       </w:r>
-      <w:bookmarkEnd w:id="8"/>
+      <w:bookmarkEnd w:id="7"/>
     </w:p>
     <w:p>
       <w:pPr>
@@ -3331,11 +3462,11 @@
       <w:pPr>
         <w:pStyle w:val="Heading2"/>
       </w:pPr>
-      <w:bookmarkStart w:id="9" w:name="_Toc235835475"/>
+      <w:bookmarkStart w:id="8" w:name="_Toc235990765"/>
       <w:r>
         <w:t>2.2 Der digitale Graben</w:t>
       </w:r>
-      <w:bookmarkEnd w:id="9"/>
+      <w:bookmarkEnd w:id="8"/>
     </w:p>
     <w:p>
       <w:pPr>
@@ -3352,7 +3483,13 @@
         <w:jc w:val="both"/>
       </w:pPr>
       <w:r>
-        <w:t>Zwei systematische Übersichtsarbeiten bestätigen und erweitern diese Perspektive. Unterschieden wird zwischen einer zweiten Ebene des digitalen Grabens, die Fähigkeiten und Nutzungsformen umfasst, und einer dritten Ebene, die sich auf die daraus entstehenden Ergebnisse bezieht; die Forschung betrachtet dabei vor allem die Nutzung und deutlich seltener die tatsächlichen Ergebnisse (Scheerder et al., 2017). Eine Klassifikation auf Basis von 50 Studien unterscheidet ebenfalls zwischen Zugangs-, Nutzungs- und Ergebnisungleichheiten (Lythreatis et al., 2022). Bildung und sozioökonomische Merkmale werden in beiden Übersichten übereinstimmend als zentrale Determinanten identifiziert (Scheerder et al., 2017; Lythreatis et al., 2022), was die in dieser Arbeit vorgenommene Unterscheidung zwischen infrastrukturbezogenen Indikatoren und digitaler Adoption stützt.</w:t>
+        <w:t xml:space="preserve">Zwei systematische Übersichtsarbeiten bestätigen und erweitern diese Perspektive. Unterschieden wird zwischen einer zweiten Ebene des digitalen Grabens, die Fähigkeiten und Nutzungsformen umfasst, und einer dritten Ebene, die sich auf die daraus </w:t>
+      </w:r>
+      <w:r>
+        <w:t>entstehenden Ergebnisse bezieht. D</w:t>
+      </w:r>
+      <w:r>
+        <w:t>ie Forschung betrachtet dabei vor allem die Nutzung und deutlich seltener die tatsächlichen Ergebnisse (Scheerder et al., 2017). Eine Klassifikation auf Basis von 50 Studien unterscheidet ebenfalls zwischen Zugangs-, Nutzungs- und Ergebnisungleichheiten (Lythreatis et al., 2022). Bildung und sozioökonomische Merkmale werden in beiden Übersichten übereinstimmend als zentrale Determinanten identifiziert (Scheerder et al., 2017; Lythreatis et al., 2022), was die in dieser Arbeit vorgenommene Unterscheidung zwischen infrastrukturbezogenen Indikatoren und digitaler Adoption stützt.</w:t>
       </w:r>
     </w:p>
     <w:p>
@@ -3365,36 +3502,30 @@
       </w:r>
       <w:r>
         <w:lastRenderedPageBreak/>
-        <w:t xml:space="preserve">Ländergruppen innerhalb der EU-27 identifizieren; diese Studie bildet den unmittelbaren methodischen Bezugspunkt der vorliegenden Clusteranalyse (Cruz-Jesus et al., 2012). Anhand von 142 Ländern zeigt sich zudem, dass sich das Digitalisierungsniveau nicht durch eine einzelne Technologie abbilden lässt, sondern mit wirtschaftlichen, sozialen und institutionellen Bedingungen zusammenhängt (Billon et al., 2010). </w:t>
-      </w:r>
-      <w:r>
-        <w:t>Eine Untersuchung von 164 europäischen Regionen zeigt darüber hinaus, dass erhebliche digitale Unterschiede auch innerhalb der Mitgliedstaaten bestehen, sodass nationale Durchschnittswerte regionale Ungleichheiten verdecken können (Vicente &amp; López, 2011). Für die EU-28 zeigen Cruz-Jesus e</w:t>
-      </w:r>
-      <w:r>
-        <w:t>t al.</w:t>
-      </w:r>
-      <w:r>
-        <w:t xml:space="preserve"> </w:t>
-      </w:r>
-      <w:r>
-        <w:t>(</w:t>
-      </w:r>
-      <w:r>
-        <w:t>2016), dass digitale Ungleichheiten zwischen Bildungsgruppen auch innerhalb formal fortgeschrittener Länder fortbestehen.</w:t>
-      </w:r>
-      <w:r>
-        <w:t xml:space="preserve"> Diese Befunde begründen die Verwendung mehrerer Indikatoren in der vorliegenden Clusteranalyse sowie die Berücksichtigung des Bildungsniveaus, verweisen zugleich aber auf eine Grenze der Analyse: Länderdaten können Unterschiede zwischen Regionen und Bildungsgruppen innerhalb eines Staates nicht abbilden.</w:t>
+        <w:t>Ländergruppen inn</w:t>
+      </w:r>
+      <w:r>
+        <w:t>erhalb der EU-27 identifizieren. D</w:t>
+      </w:r>
+      <w:r>
+        <w:t xml:space="preserve">iese Studie bildet den unmittelbaren methodischen Bezugspunkt der vorliegenden Clusteranalyse (Cruz-Jesus et al., 2012). Anhand von 142 Ländern zeigt sich zudem, dass sich das Digitalisierungsniveau nicht durch eine einzelne Technologie abbilden lässt, sondern mit wirtschaftlichen, sozialen und institutionellen Bedingungen zusammenhängt (Billon et al., 2010). </w:t>
+      </w:r>
+      <w:r>
+        <w:t xml:space="preserve">Eine Untersuchung von 164 europäischen Regionen zeigt darüber hinaus, dass erhebliche digitale Unterschiede auch innerhalb der Mitgliedstaaten bestehen, sodass nationale Durchschnittswerte regionale Ungleichheiten verdecken können (Vicente &amp; López, 2011). </w:t>
+      </w:r>
+      <w:r>
+        <w:t>Für die EU-28, einschließlich des damals noch zur Europäischen Union gehörenden Vereinigten Königreichs, zeigen Cruz-Jesus et al. (2016), dass digitale Ungleichheiten zwischen Bildungsgruppen auch innerhalb formal fortgeschrittener Länder fortbestehen. Diese Befunde begründen die Verwendung mehrerer Indikatoren in der vorliegenden Clusteranalyse sowie die Berücksichtigung des Bildungsniveaus, verweisen zugleich aber auf eine Grenze der Analyse: Länderdaten können Unterschiede zwischen Regionen und Bildungsgruppen innerhalb eines Staates nicht abbilden.</w:t>
       </w:r>
     </w:p>
     <w:p>
       <w:pPr>
         <w:pStyle w:val="Heading2"/>
       </w:pPr>
-      <w:bookmarkStart w:id="10" w:name="_Toc235835476"/>
+      <w:bookmarkStart w:id="9" w:name="_Toc235990766"/>
       <w:r>
         <w:t>2.3 Digitalisierung und wirtschaftliche Leistung: empirischer Forschungsstand</w:t>
       </w:r>
-      <w:bookmarkEnd w:id="10"/>
+      <w:bookmarkEnd w:id="9"/>
     </w:p>
     <w:p>
       <w:pPr>
@@ -3407,9 +3538,6 @@
       <w:r>
         <w:t>Einen zentralen Referenzpunkt bildet die Untersuchung von Czernich et al. (2011). Die Autoren schätzen für ein OECD-Panel der Jahre 1996 bis 2007, dass eine Erhöhung der Breitbanddurchdringung um zehn Prozentpunkte mit einem Anstieg des jährlichen Pro-Kopf-Wachstums um 0,9 bis 1,5 Prozentpunkte verbunden ist. Sie interpretieren diesen Befund als positiven kausalen Effekt der Breitbandinfrastruktur.</w:t>
       </w:r>
-      <w:r>
-        <w:t>.</w:t>
-      </w:r>
     </w:p>
     <w:p>
       <w:pPr>
@@ -3426,14 +3554,20 @@
         <w:jc w:val="both"/>
       </w:pPr>
       <w:r>
-        <w:t xml:space="preserve">Ein zweiter Literaturstrang deutet darauf hin, dass die tatsächliche Nutzung digitaler Technologien und komplementäre Fähigkeiten stärkere wirtschaftliche Zusammenhänge aufweisen können als die reine Infrastrukturverfügbarkeit </w:t>
-      </w:r>
-      <w:r>
-        <w:t xml:space="preserve">(Evangelista et al., 2014; Gal et al., </w:t>
+        <w:t xml:space="preserve">Ein zweiter Literaturstrang deutet darauf hin, dass die tatsächliche Nutzung digitaler Technologien und komplementäre Fähigkeiten stärkere wirtschaftliche Zusammenhänge </w:t>
       </w:r>
       <w:r>
         <w:lastRenderedPageBreak/>
-        <w:t>2019). Bei einer Unterscheidung zwischen ICT-Infrastruktur, tatsächlicher Nutzung und digitalem Empowerment für die EU-27 weist der Infrastrukturindex keinen robusten Zusammenhang mit dem Wachstum des BIP pro Kopf oder der Arbeitsproduktivität auf, während Nutzung und Empowerment deutlich stärkere Zusammenhänge zeigen (Evangelista et al., 2014). Auf Unternehmensebene ist eine stärkere digitale Adoption innerhalb einer Branche mit Produktivitätsgewinnen verbunden; diese fallen jedoch heterogen aus und werden durch technische sowie managementbezogene Fachkräfteengpässe abgeschwächt (Gal et al., 2019).</w:t>
+        <w:t xml:space="preserve">aufweisen können als die reine Infrastrukturverfügbarkeit </w:t>
+      </w:r>
+      <w:r>
+        <w:t>(Evangelista et al., 2014; Gal et al., 2019). Bei einer Unterscheidung zwischen ICT-Infrastruktur, tatsächlicher Nutzung und digitalem Empowerment für die EU-27 weist der Infrastrukturindex keinen robusten Zusammenhang mit dem Wachstum des BIP pro Kopf oder der Arbeitsproduktivität auf, während Nutzung und Empowerment deutlich stärkere Zusammenhänge zeigen (Evangelista et al., 2014). Auf Unternehmensebene ist eine stärkere digitale Adoption innerhalb einer Branche mit Pr</w:t>
+      </w:r>
+      <w:r>
+        <w:t>oduktivitätsgewinnen verbunden. D</w:t>
+      </w:r>
+      <w:r>
+        <w:t>iese fallen jedoch heterogen aus und werden durch technische sowie managementbezogene Fachkräfteengpässe abgeschwächt (Gal et al., 2019).</w:t>
       </w:r>
     </w:p>
     <w:p>
@@ -3458,12 +3592,12 @@
       <w:pPr>
         <w:pStyle w:val="Heading2"/>
       </w:pPr>
-      <w:bookmarkStart w:id="11" w:name="_Toc235835477"/>
+      <w:bookmarkStart w:id="10" w:name="_Toc235990767"/>
       <w:r>
         <w:lastRenderedPageBreak/>
         <w:t>2.4 Humankapital, Innovation und die Bedingtheit digitaler Erträge</w:t>
       </w:r>
-      <w:bookmarkEnd w:id="11"/>
+      <w:bookmarkEnd w:id="10"/>
     </w:p>
     <w:p>
       <w:pPr>
@@ -3471,7 +3605,13 @@
         <w:jc w:val="both"/>
       </w:pPr>
       <w:r>
-        <w:t>Die Annahme, dass die wirtschaftliche Bedeutung digitaler Technologien von komplementären Voraussetzungen abhängt, lässt sich mit der Forschung zum qualifikationsverzerrten und aufgabenbasierten technologischen Wandel verbinden (Acemoglu, 2002; Acemoglu &amp; Restrepo, 2022). Der technische Wandel verlief während eines großen Teils des 20. Jahrhunderts qualifikationsverzerrt und erhöhte die relative Nachfrage nach höher qualifizierten Arbeitskräften (Acemoglu, 2002). In einem aufgabenbasierten Modell wird diese Perspektive weiterentwickelt, indem Automatisierung zuvor menschliche Tätigkeiten auf Kapital überträgt und insbesondere routineorientierte Beschäftigtengruppen betrifft (Acemoglu &amp; Restrepo, 2022). Ein unmittelbarer Zusammenhang zwischen Digitalisierung und gesamtwirtschaftlicher Leistungsfähigkeit wird damit nicht belegt; verdeutlicht wird jedoch, dass die Folgen technologischen Wandels zwischen Qualifikationsgruppen erheblich variieren (Acemoglu, 2002; Acemoglu &amp; Restrepo, 2022).</w:t>
+        <w:t>Die Annahme, dass die wirtschaftliche Bedeutung digitaler Technologien von komplementären Voraussetzungen abhängt, lässt sich mit der Forschung zum qualifikationsverzerrten und aufgabenbasierten technologischen Wandel verbinden (Acemoglu, 2002; Acemoglu &amp; Restrepo, 2022). Der technische Wandel verlief während eines großen Teils des 20. Jahrhunderts qualifikationsverzerrt und erhöhte die relative Nachfrage nach höher qualifizierten Arbeitskräften (Acemoglu, 2002). In einem aufgabenbasierten Modell wird diese Perspektive weiterentwickelt, indem Automatisierung zuvor menschliche Tätigkeiten auf Kapital überträgt und insbesondere routineorientierte Beschäftigtengruppen betrifft (Acemoglu &amp; Restrepo, 2022). Ein unmittelbarer Zusammenhang zwischen Digitalisierung und gesamtwirtschaftlicher Leistungsfähigkeit wird damit</w:t>
+      </w:r>
+      <w:r>
+        <w:t xml:space="preserve"> nicht belegt. Es wird jedoch verdeutlicht</w:t>
+      </w:r>
+      <w:r>
+        <w:t>, dass die Folgen technologischen Wandels zwischen Qualifikationsgruppen erheblich variieren (Acemoglu, 2002; Acemoglu &amp; Restrepo, 2022).</w:t>
       </w:r>
     </w:p>
     <w:p>
@@ -3480,7 +3620,13 @@
         <w:jc w:val="both"/>
       </w:pPr>
       <w:r>
-        <w:t xml:space="preserve">Mikroökonometrische und regionale Studien liefern hierzu konsistente empirische Evidenz (Bresnahan et al., 2002; Mack &amp; Faggian, 2013; Akerman et al., 2015). Auf Unternehmensebene wirken Informationstechnologie, organisatorische Veränderungen und qualifizierte Arbeit komplementär zusammen (Bresnahan et al., 2002). Die Einführung von Breitbandinternet verbessert die Arbeitsmarktergebnisse qualifizierter Beschäftigter, während geringer qualifizierte Beschäftigte ungünstigere Ergebnisse aufweisen; als Mechanismus gilt, dass Breitband qualifizierte Arbeit bei nicht routinemäßigen Tätigkeiten ergänzt und geringer qualifizierte Arbeit bei Routinetätigkeiten teilweise ersetzt (Akerman et al., 2015). Auf regionaler Ebene bestätigt sich dieses Muster, da Breitband vor allem in Regionen mit hohem Humankapital positiv mit Produktivität verbunden ist, während der direkte Zusammenhang der Breitbandbereitstellung nicht überall gleichermaßen positiv ausfällt (Mack &amp; Faggian, 2013). </w:t>
+        <w:t>Mikroökonometrische und regionale Studien liefern hierzu konsistente empirische Evidenz (Bresnahan et al., 2002; Mack &amp; Faggian, 2013; Akerman et al., 2015). Auf Unternehmensebene wirken Informationstechnologie, organisatorische Veränderungen und qualifizierte Arbeit komplementär zusammen (Bresnahan et al., 2002). Die Einführung von Breitbandinternet verbessert die Arbeitsmarktergebnisse qualifizierter Beschäftigter, während geringer qualifizierte Beschäftigte un</w:t>
+      </w:r>
+      <w:r>
+        <w:t>günstigere Ergebnisse aufweisen. A</w:t>
+      </w:r>
+      <w:r>
+        <w:t xml:space="preserve">ls Mechanismus gilt, dass Breitband qualifizierte Arbeit bei nicht routinemäßigen Tätigkeiten ergänzt und geringer qualifizierte Arbeit bei Routinetätigkeiten teilweise ersetzt (Akerman et al., 2015). Auf regionaler Ebene bestätigt sich dieses Muster, da Breitband vor allem in Regionen mit hohem Humankapital positiv mit Produktivität verbunden ist, während der direkte Zusammenhang der Breitbandbereitstellung nicht überall gleichermaßen positiv ausfällt (Mack &amp; Faggian, 2013). </w:t>
       </w:r>
       <w:r>
         <w:t>Diese Befunde sprechen gemeinsam dafür, Humankapital als wichtige komplementäre Bedingung der produktiven Nutzung digitaler Technologien zu betrachten</w:t>
@@ -3508,18 +3654,36 @@
         <w:jc w:val="both"/>
       </w:pPr>
       <w:r>
-        <w:t>Neben dem Humankapital wird die Innovationskapazität als weiterer Faktor berücksichtigt. Anhand spanischer Unternehmensdaten zeigt sich mittels Panel-Quantilsregressionen, dass Forschungs- und Entwicklungsaktivitäten mit Umsatz-, Beschäftigungs- und Produktivitätswachstum zusammenhängen, wobei diese Zusammenhänge heterogen ausfallen (Coad et al., 2016). Ein unmittelbarer Beleg für einen gesamtwirtschaftlichen Kausaleffekt nationaler F&amp;E-Ausgaben liegt damit nicht vor; verdeutlicht wird jedoch, dass Innovationsaktivitäten bei der Analyse wirtschaftlicher Leistung zu berücksichtigen sind (Coad et al., 2016). Forschungs- und Entwicklungsausgaben dienen in dieser Arbeit daher als Kontrollvariable und näherungsweiser Indikator der Innovationskapazität.</w:t>
+        <w:t>Neben dem Humankapital wird die Innovationskapazität als weiterer Faktor berücksichtigt. Anhand spanischer Unternehmensdaten zeigt sich mittels Panel-Quantilsregressionen, dass Forschungs- und Entwicklungsaktivitäten mit Umsatz-, Beschäftigungs- und Produktivitätswachstum zusammenhängen, wobei diese Zusammenhänge heterogen ausfallen (Coad et al., 2016). Ein unmittelbarer Beleg für einen gesamtwirtschaftlichen Kausaleffekt nationaler</w:t>
+      </w:r>
+      <w:r>
+        <w:t xml:space="preserve"> </w:t>
+      </w:r>
+      <w:r>
+        <w:t>F&amp;E</w:t>
+      </w:r>
+      <w:r>
+        <w:t>-Ausgaben liegt damit nicht vor.</w:t>
+      </w:r>
+      <w:r>
+        <w:t xml:space="preserve"> </w:t>
+      </w:r>
+      <w:r>
+        <w:t xml:space="preserve">Es wird jedoch </w:t>
+      </w:r>
+      <w:r>
+        <w:t>verdeutlicht, dass Innovationsaktivitäten bei der Analyse wirtschaftlicher Leistung zu berücksichtigen sind (Coad et al., 2016). Forschungs- und Entwicklungsausgaben dienen in dieser Arbeit daher als Kontrollvariable und näherungsweiser Indikator der Innovationskapazität.</w:t>
       </w:r>
     </w:p>
     <w:p>
       <w:pPr>
         <w:pStyle w:val="Heading2"/>
       </w:pPr>
-      <w:bookmarkStart w:id="12" w:name="_Toc235835478"/>
+      <w:bookmarkStart w:id="11" w:name="_Toc235990768"/>
       <w:r>
         <w:t>2.5 Hochtechnologieexporte und wirtschaftliche Leistungsfähigkeit</w:t>
       </w:r>
-      <w:bookmarkEnd w:id="12"/>
+      <w:bookmarkEnd w:id="11"/>
     </w:p>
     <w:p>
       <w:pPr>
@@ -3547,11 +3711,11 @@
       <w:pPr>
         <w:pStyle w:val="Heading2"/>
       </w:pPr>
-      <w:bookmarkStart w:id="13" w:name="_Toc235835479"/>
+      <w:bookmarkStart w:id="12" w:name="_Toc235990769"/>
       <w:r>
         <w:t>2.6 Forschungslücke und Beitrag dieser Arbeit</w:t>
       </w:r>
-      <w:bookmarkEnd w:id="13"/>
+      <w:bookmarkEnd w:id="12"/>
     </w:p>
     <w:p>
       <w:pPr>
@@ -3589,12 +3753,12 @@
       <w:pPr>
         <w:pStyle w:val="Heading1"/>
       </w:pPr>
-      <w:bookmarkStart w:id="14" w:name="_Toc235835480"/>
+      <w:bookmarkStart w:id="13" w:name="_Toc235990770"/>
       <w:r>
         <w:lastRenderedPageBreak/>
         <w:t>Kapitel 3: Daten und Methodik</w:t>
       </w:r>
-      <w:bookmarkEnd w:id="14"/>
+      <w:bookmarkEnd w:id="13"/>
     </w:p>
     <w:p>
       <w:pPr>
@@ -3609,11 +3773,11 @@
       <w:pPr>
         <w:pStyle w:val="Heading2"/>
       </w:pPr>
-      <w:bookmarkStart w:id="15" w:name="_Toc235835481"/>
+      <w:bookmarkStart w:id="14" w:name="_Toc235990771"/>
       <w:r>
         <w:t>3.1 Datengrundlage und Quellen</w:t>
       </w:r>
-      <w:bookmarkEnd w:id="15"/>
+      <w:bookmarkEnd w:id="14"/>
     </w:p>
     <w:p>
       <w:pPr>
@@ -4902,7 +5066,14 @@
                 <w:sz w:val="18"/>
                 <w:szCs w:val="18"/>
               </w:rPr>
-              <w:t xml:space="preserve">Pro Kopf. </w:t>
+              <w:t>p</w:t>
+            </w:r>
+            <w:r>
+              <w:rPr>
+                <w:sz w:val="18"/>
+                <w:szCs w:val="18"/>
+              </w:rPr>
+              <w:t>ro Kopf</w:t>
             </w:r>
           </w:p>
         </w:tc>
@@ -5136,7 +5307,13 @@
         <w:jc w:val="both"/>
       </w:pPr>
       <w:r>
-        <w:t>Bei der Zusammenführung der Daten war eine Harmonisierung der Ländercodes erforderlich, da Eurostat und Weltbank teilweise unterschiedliche Kennungen verwenden; beispielsweise wird Griechenland bei der Weltbank unter dem Code GRC geführt. Die drei aus der Weltbank-Programmierschnittstelle bezogenen Variablen (Festnetz-Breitband, sichere Internet-Server und Hochtechnologieexporte) ergänzen die Eurostat-Indikatoren um Dimensionen, die in den Eurostat-Daten nicht oder nur unvollständig verfügbar waren.</w:t>
+        <w:t>Bei der Zusammenführung der Daten war eine Harmonisierung der Ländercodes erforderlich, da Eurostat und Weltbank teilweise unter</w:t>
+      </w:r>
+      <w:r>
+        <w:t>schiedliche Kennungen verwenden. B</w:t>
+      </w:r>
+      <w:r>
+        <w:t>eispielsweise wird Griechenland bei der Weltbank unter dem Code GRC geführt. Die drei aus der Weltbank-Programmierschnittstelle bezogenen Variablen (Festnetz-Breitband, sichere Internet-Server und Hochtechnologieexporte) ergänzen die Eurostat-Indikatoren um Dimensionen, die in den Eurostat-Daten nicht oder nur unvollständig verfügbar waren.</w:t>
       </w:r>
     </w:p>
     <w:p/>
@@ -5144,12 +5321,12 @@
       <w:pPr>
         <w:pStyle w:val="Heading2"/>
       </w:pPr>
-      <w:bookmarkStart w:id="16" w:name="_Toc235835482"/>
+      <w:bookmarkStart w:id="15" w:name="_Toc235990772"/>
       <w:r>
         <w:lastRenderedPageBreak/>
         <w:t>3.2 Datenaufbereitung</w:t>
       </w:r>
-      <w:bookmarkEnd w:id="16"/>
+      <w:bookmarkEnd w:id="15"/>
     </w:p>
     <w:p>
       <w:pPr>
@@ -5185,7 +5362,7 @@
         <w:jc w:val="both"/>
       </w:pPr>
       <w:r>
-        <w:t>Auch die Variable Cloud Computing erforderte eine umfangreichere Aufbereitung. Sie wies 87 fehlende Werte auf. Fehlende Beobachtungen zwischen zwei vorhandenen Jahreswerten wurden innerhalb der jeweiligen Länderzeitreihe linear interpoliert. Fehlende Werte am Anfang oder Ende einer Zeitreihe wurden durch den jeweils nächstgelegenen beobachteten Wert ergänzt. Da damit rund 40 Prozent der Cloud-Beobachtungen nicht auf originären Messwerten beruhen, wird diese Variable ausschließlich in der explorativen Clusteranalyse und nicht in den Panelregressionen verwendet. Die damit verbundene Einschränkung wird in Abschnitt 5.4 diskutiert.</w:t>
+        <w:t xml:space="preserve">Auch die Variable Cloud Computing erforderte eine umfangreichere Aufbereitung. Sie wies 87 fehlende Werte auf. Fehlende Beobachtungen zwischen zwei vorhandenen Jahreswerten wurden innerhalb der jeweiligen Länderzeitreihe linear interpoliert. Fehlende Werte am Anfang oder Ende einer Zeitreihe wurden durch den jeweils nächstgelegenen beobachteten Wert ergänzt. Da damit rund 40 Prozent der Cloud-Beobachtungen nicht auf originären Messwerten beruhen, wird diese Variable ausschließlich in der explorativen Clusteranalyse und nicht in den Panelregressionen verwendet. </w:t>
       </w:r>
     </w:p>
     <w:p>
@@ -5206,7 +5383,10 @@
         <w:t>isoc_ec_ib20</w:t>
       </w:r>
       <w:r>
-        <w:t xml:space="preserve"> verwendet wird. Beide Datensätze erfassen den Anteil der Personen, die online eingekauft haben, unterscheiden sich jedoch im Erhebungsdesign. Ein methodisch bedingter Bruch der Zeitreihe zwischen 2019 und 2020 kann daher nicht vollständig ausgeschlossen werden. Diese Einschränkung wird ebenfalls in Abschnitt 5.4 berücksichtigt.</w:t>
+        <w:t xml:space="preserve"> verwendet wird. Beide Datensätze erfassen den Anteil der Personen, die online eingekauft haben, unterscheiden sich jedoch im Erhebungsdesign. Ein methodisch bedingter Bruch der Zeitreihe zwischen 2019 und 2020 kann daher nicht vol</w:t>
+      </w:r>
+      <w:r>
+        <w:t>lständig ausgeschlossen werden.</w:t>
       </w:r>
     </w:p>
     <w:p>
@@ -6383,11 +6563,11 @@
       <w:pPr>
         <w:pStyle w:val="Heading2"/>
       </w:pPr>
-      <w:bookmarkStart w:id="17" w:name="_Toc235835483"/>
+      <w:bookmarkStart w:id="16" w:name="_Toc235990773"/>
       <w:r>
         <w:t>3.3 Deskriptive Statistik</w:t>
       </w:r>
-      <w:bookmarkEnd w:id="17"/>
+      <w:bookmarkEnd w:id="16"/>
     </w:p>
     <w:p>
       <w:pPr>
@@ -6395,7 +6575,13 @@
         <w:jc w:val="both"/>
       </w:pPr>
       <w:r>
-        <w:t xml:space="preserve">Vor der eigentlichen Modellierung gibt die deskriptive Statistik einen Überblick über die Verteilung der Variablen. Tabelle 3 berichtet Mittelwert, Standardabweichung, Minimum, Quartile und Maximum für alle Regressionsvariablen. Das Bruttoinlandsprodukt pro Kopf reicht von rund 15.300 bis knapp 97.700 Kaufkraftstandards (PPS) bei einem Mittelwert von etwa 34.700 Kaufkraftstandards, was die erhebliche wirtschaftliche Heterogenität der EU-27 verdeutlicht. Das Bildungsniveau variiert zwischen 48,4 und 89,2 Prozent; es handelt sich somit bewusst um einen breiten Bildungsindikator, der das allgemeine Qualifikationsniveau der Bevölkerung und nicht ausschließlich die Tertiärbildung (ISCED 5–8) abbildet. Auffällig ist die sehr große Streuung der sicheren Internet-Server (Standardabweichung von über 64.000), die eine logarithmische Transformation dieser Variablen für </w:t>
+        <w:t>Vor der eigentlichen Modellierung gibt die deskriptive Statistik einen Überblick über die Verteilung der Variablen. Tabelle 3 berichtet Mittelwert, Standardabweichung, Minimum, Quartile und Maximum für alle Regressionsvariablen. Das Bruttoinlandsprodukt pro Kopf reicht von rund 15.300 bis knapp 97.700 Kaufkraftstandards (PPS) bei einem Mittelwert von etwa 34.700 Kaufkraftstandards, was die erhebliche wirtschaftliche Heterogenität der EU-27 verdeutlicht. Das Bildungsniveau variiert</w:t>
+      </w:r>
+      <w:r>
+        <w:t xml:space="preserve"> zwischen 48,4 und 89,2 Prozent. E</w:t>
+      </w:r>
+      <w:r>
+        <w:t xml:space="preserve">s handelt sich somit bewusst um einen breiten Bildungsindikator, der das allgemeine Qualifikationsniveau der Bevölkerung und nicht ausschließlich die Tertiärbildung (ISCED 5–8) abbildet. Auffällig ist die sehr große Streuung der sicheren Internet-Server (Standardabweichung von über 64.000), die eine logarithmische Transformation dieser Variablen für </w:t>
       </w:r>
       <w:r>
         <w:t>die Regressionsanalyse nahelegt.</w:t>
@@ -8588,14 +8774,14 @@
           <w:lang w:val="en-US"/>
         </w:rPr>
       </w:pPr>
-      <w:bookmarkStart w:id="18" w:name="_Toc235835484"/>
+      <w:bookmarkStart w:id="17" w:name="_Toc235990774"/>
       <w:r>
         <w:rPr>
           <w:lang w:val="en-US"/>
         </w:rPr>
         <w:t>3.4 K-Means-Clusteranalyse</w:t>
       </w:r>
-      <w:bookmarkEnd w:id="18"/>
+      <w:bookmarkEnd w:id="17"/>
     </w:p>
     <w:p>
       <w:pPr>
@@ -8733,11 +8919,11 @@
       <w:pPr>
         <w:pStyle w:val="Heading2"/>
       </w:pPr>
-      <w:bookmarkStart w:id="19" w:name="_Toc235835485"/>
+      <w:bookmarkStart w:id="18" w:name="_Toc235990775"/>
       <w:r>
         <w:t>3.5 Panel-Regressionsmodell</w:t>
       </w:r>
-      <w:bookmarkEnd w:id="19"/>
+      <w:bookmarkEnd w:id="18"/>
     </w:p>
     <w:p>
       <w:pPr>
@@ -9473,7 +9659,15 @@
                 <w:szCs w:val="18"/>
                 <w:lang w:val="en-US"/>
               </w:rPr>
-              <w:t>Two-Way FE (Robustheit, Multikollinearität)</w:t>
+              <w:t>Two-Way FE (Diagnostik</w:t>
+            </w:r>
+            <w:r>
+              <w:rPr>
+                <w:sz w:val="18"/>
+                <w:szCs w:val="18"/>
+                <w:lang w:val="en-US"/>
+              </w:rPr>
+              <w:t>, Multikollinearität)</w:t>
             </w:r>
           </w:p>
         </w:tc>
@@ -10224,11 +10418,11 @@
       <w:pPr>
         <w:pStyle w:val="Heading2"/>
       </w:pPr>
-      <w:bookmarkStart w:id="20" w:name="_Toc235835486"/>
+      <w:bookmarkStart w:id="19" w:name="_Toc235990776"/>
       <w:r>
         <w:t>3.6 Interaktionsanalyse</w:t>
       </w:r>
-      <w:bookmarkEnd w:id="20"/>
+      <w:bookmarkEnd w:id="19"/>
     </w:p>
     <w:p>
       <w:pPr>
@@ -10249,18 +10443,24 @@
         <w:jc w:val="both"/>
       </w:pPr>
       <w:r>
-        <w:t>Bei der Schätzung von Interaktionsmodellen werden zwei methodische Standards beachtet. Erstens werden die in den Interaktionsterm eingehenden Variablen vor der Bildung des Produkts um ihren Mittelwert zentriert (grand-mean centering); dies reduziert die rechnerische Multikollinearität zwischen dem Interaktionsterm und seinen Bestandteilen und erleichtert die Interpretation. Zweitens werden die konstitutiven Einzelterme stets gemeinsam mit dem Interaktionsterm in das Modell aufgenommen. Die inhaltliche Interpretation erfolgt über den marginalen Effekt, der angibt, wie sich der Einfluss der Digitalisierungsvariablen auf das Bruttoinlandsprodukt mit steigendem Bildungsniveau verändert.</w:t>
+        <w:t>Bei der Schätzung von Interaktionsmodellen werden zwei methodische Standards beachtet. Erstens werden die in den Interaktionsterm eingehenden Variablen vor der Bildung des Produkts um ihren Mittelwert z</w:t>
+      </w:r>
+      <w:r>
+        <w:t>entriert (grand-mean centering). D</w:t>
+      </w:r>
+      <w:r>
+        <w:t>ies reduziert die rechnerische Multikollinearität zwischen dem Interaktionsterm und seinen Bestandteilen und erleichtert die Interpretation. Zweitens werden die konstitutiven Einzelterme stets gemeinsam mit dem Interaktionsterm in das Modell aufgenommen. Die inhaltliche Interpretation erfolgt über den marginalen Effekt, der angibt, wie sich der Einfluss der Digitalisierungsvariablen auf das Bruttoinlandsprodukt mit steigendem Bildungsniveau verändert.</w:t>
       </w:r>
     </w:p>
     <w:p>
       <w:pPr>
         <w:pStyle w:val="Heading2"/>
       </w:pPr>
-      <w:bookmarkStart w:id="21" w:name="_Toc235835487"/>
+      <w:bookmarkStart w:id="20" w:name="_Toc235990777"/>
       <w:r>
         <w:t>3.7 Multikollinearitätsprüfung</w:t>
       </w:r>
-      <w:bookmarkEnd w:id="21"/>
+      <w:bookmarkEnd w:id="20"/>
     </w:p>
     <w:p>
       <w:pPr>
@@ -11050,7 +11250,7 @@
     </w:tbl>
     <w:p>
       <w:pPr>
-        <w:spacing w:before="60"/>
+        <w:spacing w:before="40" w:after="200"/>
         <w:jc w:val="center"/>
       </w:pPr>
       <w:r>
@@ -11061,17 +11261,8 @@
           <w:sz w:val="16"/>
           <w:szCs w:val="16"/>
         </w:rPr>
-        <w:t>Anmerkung: Faustregel, VIF &gt; 10 deutet auf problematische Multikollinearität hin (orange). Nach Zentrierung liegen in Modell 10 alle Werte unter 10 (grün).</w:t>
-      </w:r>
-    </w:p>
-    <w:p>
-      <w:pPr>
-        <w:spacing w:before="40" w:after="200"/>
-        <w:jc w:val="center"/>
-        <w:rPr>
-          <w:lang w:val="en-US"/>
-        </w:rPr>
-      </w:pPr>
+        <w:t xml:space="preserve">Quelle: Eigene Berechnung. </w:t>
+      </w:r>
       <w:r>
         <w:rPr>
           <w:i/>
@@ -11080,17 +11271,6 @@
           <w:sz w:val="16"/>
           <w:szCs w:val="16"/>
         </w:rPr>
-        <w:t xml:space="preserve">Quelle: Eigene Berechnung. </w:t>
-      </w:r>
-      <w:r>
-        <w:rPr>
-          <w:i/>
-          <w:iCs/>
-          <w:color w:val="595959"/>
-          <w:sz w:val="16"/>
-          <w:szCs w:val="16"/>
-          <w:lang w:val="en-US"/>
-        </w:rPr>
         <w:t>Notebook: 03_regression.ipynb, Zelle 7. Datenbasis: Eurostat, World Bank (master_panel_clean.xlsx).</w:t>
       </w:r>
     </w:p>
@@ -11100,7 +11280,10 @@
         <w:jc w:val="both"/>
       </w:pPr>
       <w:r>
-        <w:t>Die VIF-Analyse bestätigt das Multikollinearitätsproblem: Bei gemeinsamer Aufnahme der drei Internetvariablen erreicht die Internetnutzung einen VIF von 11,63. Modell M4 wird daher nur diagnostisch verwendet. Im finalen Modell M10 liegen alle VIF-Werte nach der Zentrierung unter 2,64, sodass kein Hinweis auf problematische Multikollinearität besteht.</w:t>
+        <w:t>Die VIF-Analyse weist gemeinsam mit den hohen Korrelationen auf ein Multikollinearitätsproblem hin.</w:t>
+      </w:r>
+      <w:r>
+        <w:t xml:space="preserve"> Bei gemeinsamer Aufnahme der drei Internetvariablen erreicht die Internetnutzung einen VIF von 11,63. Modell M4 wird daher nur diagnostisch verwendet. Im finalen Modell M10 liegen alle VIF-Werte nach der Zentrierung unter 2,64, sodass kein Hinweis auf problematische Multikollinearität besteht.</w:t>
       </w:r>
     </w:p>
     <w:p>
@@ -11113,11 +11296,11 @@
       <w:pPr>
         <w:pStyle w:val="Heading1"/>
       </w:pPr>
-      <w:bookmarkStart w:id="22" w:name="_Toc235835488"/>
+      <w:bookmarkStart w:id="21" w:name="_Toc235990778"/>
       <w:r>
         <w:t>Kapitel 4: Ergebnisse</w:t>
       </w:r>
-      <w:bookmarkEnd w:id="22"/>
+      <w:bookmarkEnd w:id="21"/>
     </w:p>
     <w:p>
       <w:pPr>
@@ -11132,11 +11315,11 @@
       <w:pPr>
         <w:pStyle w:val="Heading2"/>
       </w:pPr>
-      <w:bookmarkStart w:id="23" w:name="_Toc235835489"/>
+      <w:bookmarkStart w:id="22" w:name="_Toc235990779"/>
       <w:r>
         <w:t>4.1 Ergebnisse der Clusteranalyse</w:t>
       </w:r>
-      <w:bookmarkEnd w:id="23"/>
+      <w:bookmarkEnd w:id="22"/>
     </w:p>
     <w:p>
       <w:pPr>
@@ -12247,21 +12430,21 @@
       <w:pPr>
         <w:pStyle w:val="Heading2"/>
       </w:pPr>
-      <w:bookmarkStart w:id="24" w:name="_Toc235835490"/>
+      <w:bookmarkStart w:id="23" w:name="_Toc235990780"/>
       <w:r>
         <w:t>4.2 Ergebnisse der Regressionsanalyse</w:t>
       </w:r>
+      <w:bookmarkEnd w:id="23"/>
+    </w:p>
+    <w:p>
+      <w:pPr>
+        <w:pStyle w:val="Heading3"/>
+      </w:pPr>
+      <w:bookmarkStart w:id="24" w:name="_Toc235990781"/>
+      <w:r>
+        <w:t>4.2.1 Einzelindikator-Modelle (M1–M3)</w:t>
+      </w:r>
       <w:bookmarkEnd w:id="24"/>
-    </w:p>
-    <w:p>
-      <w:pPr>
-        <w:pStyle w:val="Heading3"/>
-      </w:pPr>
-      <w:bookmarkStart w:id="25" w:name="_Toc235835491"/>
-      <w:r>
-        <w:t>4.2.1 Einzelindikator-Modelle (M1–M3)</w:t>
-      </w:r>
-      <w:bookmarkEnd w:id="25"/>
     </w:p>
     <w:p>
       <w:pPr>
@@ -16622,11 +16805,11 @@
       <w:pPr>
         <w:pStyle w:val="Heading3"/>
       </w:pPr>
-      <w:bookmarkStart w:id="26" w:name="_Toc235835492"/>
+      <w:bookmarkStart w:id="25" w:name="_Toc235990782"/>
       <w:r>
         <w:t>4.2.2 Multikollinearität im kombinierten Internetmodell (M4)</w:t>
       </w:r>
-      <w:bookmarkEnd w:id="26"/>
+      <w:bookmarkEnd w:id="25"/>
     </w:p>
     <w:p>
       <w:pPr>
@@ -16638,18 +16821,24 @@
       </w:r>
       <w:r>
         <w:lastRenderedPageBreak/>
-        <w:t>zeigt sich das Problem darin, dass sich das Vorzeichen des Internetzugangs ins Negative kehrt und die Koeffizienten instabil werden. Aus diesem Grund wird Modell M4 nicht inhaltlich interpretiert; es untermauert allein die Entscheidung, die Internetvariablen in den übrigen Modellen getrennt zu betrachten.</w:t>
+        <w:t>zeigt sich das Problem darin, dass sich das Vorzeichen des Internetzugangs ins Negative kehrt und die Koeffizienten instabil werden. Aus diesem Grund wird Modell M4</w:t>
+      </w:r>
+      <w:r>
+        <w:t xml:space="preserve"> nicht inhaltlich interpretiert. E</w:t>
+      </w:r>
+      <w:r>
+        <w:t>s untermauert allein die Entscheidung, die Internetvariablen in den übrigen Modellen getrennt zu betrachten.</w:t>
       </w:r>
     </w:p>
     <w:p>
       <w:pPr>
         <w:pStyle w:val="Heading3"/>
       </w:pPr>
-      <w:bookmarkStart w:id="27" w:name="_Toc235835493"/>
+      <w:bookmarkStart w:id="26" w:name="_Toc235990783"/>
       <w:r>
         <w:t>4.2.3 Infrastruktur- und Outputvariablen (M7–M9)</w:t>
       </w:r>
-      <w:bookmarkEnd w:id="27"/>
+      <w:bookmarkEnd w:id="26"/>
     </w:p>
     <w:p>
       <w:pPr>
@@ -16670,11 +16859,11 @@
       <w:pPr>
         <w:pStyle w:val="Heading3"/>
       </w:pPr>
-      <w:bookmarkStart w:id="28" w:name="_Toc235835494"/>
+      <w:bookmarkStart w:id="27" w:name="_Toc235990784"/>
       <w:r>
         <w:t>4.2.4 Interaktionsmodelle (M5 und M6)</w:t>
       </w:r>
-      <w:bookmarkEnd w:id="28"/>
+      <w:bookmarkEnd w:id="27"/>
     </w:p>
     <w:p>
       <w:pPr>
@@ -16893,11 +17082,11 @@
       <w:pPr>
         <w:pStyle w:val="Heading3"/>
       </w:pPr>
-      <w:bookmarkStart w:id="29" w:name="_Toc235835495"/>
+      <w:bookmarkStart w:id="28" w:name="_Toc235990785"/>
       <w:r>
         <w:t>4.2.5 Finales kombiniertes Modell (M10)</w:t>
       </w:r>
-      <w:bookmarkEnd w:id="29"/>
+      <w:bookmarkEnd w:id="28"/>
     </w:p>
     <w:p>
       <w:pPr>
@@ -17736,7 +17925,13 @@
         <w:t>der Internetkäufe bleibt für sich genommen insignifikant.</w:t>
       </w:r>
       <w:r>
-        <w:t xml:space="preserve"> Abbildung 11 zeigt, dass der geschätzte marginale Zusammenhang der Internetkäufe mit dem BIP pro Kopf bei höherem Bildungsniveau positiver wird. Der Punktschätzer wird ab etwa 67 Prozent positiv; dieser Wert stellt jedoch keinen statistisch signifikanten Schwellenwert dar, da das 95-Prozent-Konfidenzintervall weiterhin null einschließt.</w:t>
+        <w:t xml:space="preserve"> Abbildung 11 zeigt, dass der geschätzte marginale Zusammenhang der Internetkäufe mit dem BIP pro Kopf bei höherem Bildungsniveau positiver wird. Der Punktschätzer </w:t>
+      </w:r>
+      <w:r>
+        <w:t>wird ab etwa 67 Prozent positiv. D</w:t>
+      </w:r>
+      <w:r>
+        <w:t>ieser Wert stellt jedoch keinen statistisch signifikanten Schwellenwert dar, da das 95-Prozent-Konfidenzintervall weiterhin null einschließt.</w:t>
       </w:r>
     </w:p>
     <w:p>
@@ -18067,12 +18262,12 @@
       <w:r>
         <w:br w:type="page"/>
       </w:r>
-      <w:bookmarkStart w:id="30" w:name="_Toc235835496"/>
+      <w:bookmarkStart w:id="29" w:name="_Toc235990786"/>
       <w:r>
         <w:lastRenderedPageBreak/>
         <w:t>Kapitel 5: Diskussion</w:t>
       </w:r>
-      <w:bookmarkEnd w:id="30"/>
+      <w:bookmarkEnd w:id="29"/>
     </w:p>
     <w:p>
       <w:pPr>
@@ -18087,11 +18282,11 @@
       <w:pPr>
         <w:pStyle w:val="Heading2"/>
       </w:pPr>
-      <w:bookmarkStart w:id="31" w:name="_Toc235835497"/>
+      <w:bookmarkStart w:id="30" w:name="_Toc235990787"/>
       <w:r>
         <w:t>5.1 Interpretation der Ergebnisse der Clusteranalyse</w:t>
       </w:r>
-      <w:bookmarkEnd w:id="31"/>
+      <w:bookmarkEnd w:id="30"/>
     </w:p>
     <w:p>
       <w:pPr>
@@ -18137,22 +18332,22 @@
       <w:pPr>
         <w:pStyle w:val="Heading2"/>
       </w:pPr>
-      <w:bookmarkStart w:id="32" w:name="_Toc235835498"/>
+      <w:bookmarkStart w:id="31" w:name="_Toc235990788"/>
       <w:r>
         <w:t>5.2 Interpretation der Regressionsergebnisse</w:t>
       </w:r>
-      <w:bookmarkEnd w:id="32"/>
+      <w:bookmarkEnd w:id="31"/>
     </w:p>
     <w:p>
       <w:pPr>
         <w:pStyle w:val="Heading3"/>
         <w:spacing w:before="180"/>
       </w:pPr>
-      <w:bookmarkStart w:id="33" w:name="_Toc235835499"/>
+      <w:bookmarkStart w:id="32" w:name="_Toc235990789"/>
       <w:r>
         <w:t>5.2.1 Forschung und Entwicklung als konsistenter Zusammenhang</w:t>
       </w:r>
-      <w:bookmarkEnd w:id="33"/>
+      <w:bookmarkEnd w:id="32"/>
     </w:p>
     <w:p>
       <w:pPr>
@@ -18160,7 +18355,13 @@
         <w:jc w:val="both"/>
       </w:pPr>
       <w:r>
-        <w:t>Die Forschungs- und Entwicklungsausgaben liefern das stabilste Ergebnis der gesamten Analyse. In allen zehn Modellen ist ihr Koeffizient positiv und mindestens auf dem Zehn-Prozent-Niveau statistisch signifikant; im finalen Modell M10 beträgt er 11,4 bei einem p-Wert von 0,029. Steigende Forschungs- und Entwicklungsausgaben innerhalb eines Mitgliedstaates gehen somit systematisch mit einem höheren Bruttoinlandsprodukt pro Kopf einher, unabhängig davon, welche digitalen Indikatoren zusätzlich in das Modell aufgenommen werden.</w:t>
+        <w:t>Die Forschungs- und Entwicklungsausgaben liefern das stabilste Ergebnis der gesamten Analyse. In allen zehn Modellen ist ihr Koeffizient positiv und mindestens auf dem Zehn-Prozent-N</w:t>
+      </w:r>
+      <w:r>
+        <w:t>iveau statistisch signifikant. I</w:t>
+      </w:r>
+      <w:r>
+        <w:t>m finalen Modell M10 beträgt er 11,4 bei einem p-Wert von 0,029. Steigende Forschungs- und Entwicklungsausgaben innerhalb eines Mitgliedstaates gehen somit systematisch mit einem höheren Bruttoinlandsprodukt pro Kopf einher, unabhängig davon, welche digitalen Indikatoren zusätzlich in das Modell aufgenommen werden.</w:t>
       </w:r>
     </w:p>
     <w:p>
@@ -18180,11 +18381,11 @@
         <w:pStyle w:val="Heading3"/>
         <w:spacing w:before="180"/>
       </w:pPr>
-      <w:bookmarkStart w:id="34" w:name="_Toc235835500"/>
+      <w:bookmarkStart w:id="33" w:name="_Toc235990790"/>
       <w:r>
         <w:t>5.2.2 Der bildungsabhängige Zusammenhang der digitalen Adoption</w:t>
       </w:r>
-      <w:bookmarkEnd w:id="34"/>
+      <w:bookmarkEnd w:id="33"/>
     </w:p>
     <w:p>
       <w:pPr>
@@ -18192,7 +18393,7 @@
         <w:jc w:val="both"/>
       </w:pPr>
       <w:r>
-        <w:t>Das zentrale Ergebnis der Regressionsanalyse besteht darin, dass der Zusammenhang zwischen digitaler Adoption und wirtschaftlicher Leistungsfähigkeit vom Bildungsniveau abhängt. In beiden Interaktionsmodellen ist der Interaktionsterm auf dem Fünf-Prozent-Niveau signifikant: 17,7 für die Internetnutzung (M5) und 8,5 für die Internetkäufe (M6). Auch im finalen Modell M10 bleibt der Interaktionsterm mit 7,7 signifikant, während der Koeffizient der Internetkäufe für sich genommen mit einem p-Wert von 0,383 nicht signifikant ist. Je höher das Bildungsniveau eines Mitgliedstaates, desto positiver fällt der geschätzte Zusammenhang zwischen digitaler Adoption und Bruttoinlandsprodukt pro Kopf aus; der marginale Zusammenhang wechselt bei einem Bildungsniveau von etwa 67 Prozent das Vorzeichen.</w:t>
+        <w:t>Das zentrale Ergebnis der Regressionsanalyse besteht darin, dass der Zusammenhang zwischen digitaler Adoption und wirtschaftlicher Leistungsfähigkeit nicht einheitlich ausfällt, sondern mit dem Bildungsniveau variiert.</w:t>
       </w:r>
     </w:p>
     <w:p>
@@ -18201,8 +18402,14 @@
         <w:jc w:val="both"/>
       </w:pPr>
       <w:r>
+        <w:t xml:space="preserve">In beiden Interaktionsmodellen ist der Interaktionsterm auf dem Fünf-Prozent-Niveau signifikant: 17,7 für die Internetnutzung (M5) und 8,5 für die Internetkäufe (M6). Auch im finalen Modell M10 bleibt der Interaktionsterm mit 7,7 signifikant, während der Koeffizient der Internetkäufe für sich genommen mit einem p-Wert von 0,383 nicht signifikant ist. </w:t>
+      </w:r>
+      <w:r>
+        <w:t xml:space="preserve">Je höher das Bildungsniveau eines Mitgliedstaates, desto positiver fällt der geschätzte Zusammenhang zwischen digitaler Adoption und Bruttoinlandsprodukt pro Kopf aus. Der marginale Punktschätzer wechselt bei einem Bildungsniveau von etwa 67 Prozent das Vorzeichen. Wie </w:t>
+      </w:r>
+      <w:r>
         <w:lastRenderedPageBreak/>
-        <w:t>Dieser Befund erklärt zugleich, warum die Einzelindikator-Modelle M1 bis M3 keine signifikanten Koeffizienten liefern. Ein Modell ohne Interaktionsterm schätzt einen einheitlichen Durchschnittszusammenhang für alle Mitgliedstaaten und übersieht damit, dass dieser Zusammenhang zwischen den Ländern systematisch variiert. Die ausbleibenden direkten Zusammenhänge sind vor diesem Hintergrund kein Mangel der Analyse, sondern ein theoretisch erwartetes Ergebnis.</w:t>
+        <w:t>Wie in Abschnitt 4.2.5 dargestellt, schließt das 95-Prozent-Konfidenzintervall über den gesamten Bildungsbereich jedoch null ein, sodass dieser Wert keinen statistisch abgesicherten Schwellenwert darstellt. Dieser Befund kann zugleich dazu beitragen, die nicht signifikanten Koeffizienten der Einzelindikator-Modelle M1 bis M3 einzuordnen. Modelle ohne Interaktionsterm schätzen einen einheitlichen Durchschnittszusammenhang für alle Mitgliedstaaten und berücksichtigen nicht, dass dieser Zusammenhang mit dem Bildungsniveau variieren kann. Die ausbleibenden direkten Zusammenhänge sind daher nicht zwangsläufig als Mangel der Analyse zu verstehen, sondern können mit der Heterogenität dieses Zusammenhangs zwischen den Mitgliedstaaten in Verbindung stehen.</w:t>
       </w:r>
     </w:p>
     <w:p>
@@ -18219,11 +18426,11 @@
         <w:pStyle w:val="Heading3"/>
         <w:spacing w:before="180"/>
       </w:pPr>
-      <w:bookmarkStart w:id="35" w:name="_Toc235835501"/>
+      <w:bookmarkStart w:id="34" w:name="_Toc235990791"/>
       <w:r>
         <w:t>5.2.3 Hochtechnologieexporte als eigenständiger Zusammenhang</w:t>
       </w:r>
-      <w:bookmarkEnd w:id="35"/>
+      <w:bookmarkEnd w:id="34"/>
     </w:p>
     <w:p>
       <w:pPr>
@@ -18231,7 +18438,13 @@
         <w:jc w:val="both"/>
       </w:pPr>
       <w:r>
-        <w:t>Unter den einzelnen Indikatoren weisen die Hochtechnologieexporte den stärksten eigenständigen Zusammenhang mit der wirtschaftlichen Leistungsfähigkeit auf. Im Einzelmodell M9 beträgt der Koeffizient 286,0 bei einem Within-R² von 0,419, dem höchsten Erklärungsgehalt aller Einzelindikator-Modelle; im finalen Modell M10 bleibt er mit 191,5 und einem p-Wert von 0,024 signifikant. Die übrigen Infrastrukturvariablen, das Festnetz-Breitband (M7) und die logarithmierten sicheren Internet-Server (M8), sind dagegen nicht signifikant.</w:t>
+        <w:t xml:space="preserve">Unter den einzelnen Indikatoren weisen die Hochtechnologieexporte den stärksten eigenständigen Zusammenhang mit der wirtschaftlichen Leistungsfähigkeit auf. Im Einzelmodell M9 beträgt der Koeffizient 286,0 bei einem Within-R² von 0,419, dem höchsten Erklärungsgehalt </w:t>
+      </w:r>
+      <w:r>
+        <w:t>aller Einzelindikator-Modelle. I</w:t>
+      </w:r>
+      <w:r>
+        <w:t>m finalen Modell M10 bleibt er mit 191,5 und einem p-Wert von 0,024 signifikant. Die übrigen Infrastrukturvariablen, das Festnetz-Breitband (M7) und die logarithmierten sicheren Internet-Server (M8), sind dagegen nicht signifikant.</w:t>
       </w:r>
     </w:p>
     <w:p>
@@ -18240,32 +18453,34 @@
         <w:jc w:val="both"/>
       </w:pPr>
       <w:r>
-        <w:t xml:space="preserve">Dieser Kontrast bestätigt die in Abschnitt 2.5 entwickelte Unterscheidung. Während die Zugangs- und Nutzungsindikatoren erfassen, in welchem Umfang digitale Technologien in einem Land vorhanden und angewendet werden, bildet der Anteil der Hochtechnologieexporte ab, in welchem Umfang ein Land technologieintensive Güter selbst herstellt. Dass für die wirtschaftliche Entwicklung nicht das Exportvolumen, sondern die technologische Zusammensetzung des Exportkorbs maßgeblich ist (Hausmann et al., 2007) und dass technologische Fähigkeiten mit der Exportleistung zusammenhängen (Mazzi &amp; Foster-McGregor, 2021), findet hier eine Entsprechung auf der Ebene der Mitgliedstaaten. Zu berücksichtigen bleibt, dass Hochtechnologieexporte neben digitalen auch weitere </w:t>
+        <w:t xml:space="preserve">Dieser Kontrast bestätigt die in Abschnitt 2.5 entwickelte Unterscheidung. Während die Zugangs- und Nutzungsindikatoren erfassen, in welchem Umfang digitale Technologien in einem Land vorhanden und angewendet werden, bildet der Anteil der Hochtechnologieexporte ab, in welchem Umfang ein Land technologieintensive Güter selbst herstellt. Dass für die wirtschaftliche Entwicklung nicht das Exportvolumen, sondern die technologische Zusammensetzung des Exportkorbs maßgeblich ist (Hausmann et al., 2007) und dass </w:t>
       </w:r>
       <w:r>
         <w:lastRenderedPageBreak/>
-        <w:t>forschungsintensive Produktgruppen umfassen und der Koeffizient somit eine breitere technologieintensive Exportstruktur abbildet.</w:t>
-      </w:r>
+        <w:t>technologische Fähigkeiten mit der Exportleistung zusammenhängen (Mazzi &amp; Foster-McGregor, 2021), findet hier eine Entsprechung auf der Ebene der Mitgliedstaaten. Zu berücksichtigen bleibt, dass Hochtechnologieexporte neben digitalen auch weitere forschungsintensive Produktgruppen umfassen und der Koeffizient somit eine breitere technologieintensive Exportstruktu</w:t>
+      </w:r>
+      <w:r>
+        <w:t>r abbildet.</w:t>
+      </w:r>
+    </w:p>
+    <w:p>
+      <w:pPr>
+        <w:pStyle w:val="Heading2"/>
+      </w:pPr>
+      <w:bookmarkStart w:id="35" w:name="_Toc235990792"/>
+      <w:r>
+        <w:t>5.3 Einordnung in den Forschungsstand</w:t>
+      </w:r>
+      <w:bookmarkEnd w:id="35"/>
     </w:p>
     <w:p>
       <w:pPr>
         <w:spacing w:after="120" w:line="360" w:lineRule="auto"/>
         <w:jc w:val="both"/>
-        <w:rPr>
-          <w:b/>
-          <w:bCs/>
-        </w:rPr>
-      </w:pPr>
-    </w:p>
-    <w:p>
-      <w:pPr>
-        <w:pStyle w:val="Heading2"/>
-      </w:pPr>
-      <w:bookmarkStart w:id="36" w:name="_Toc235835502"/>
-      <w:r>
-        <w:t>5.3 Einordnung in den Forschungsstand</w:t>
-      </w:r>
-      <w:bookmarkEnd w:id="36"/>
+      </w:pPr>
+      <w:r>
+        <w:t>Die Ergebnisse fügen sich in mehrfacher Hinsicht in den in Kapitel 2 dargestellten Forschungsstand ein. Für die digitalen Zugangs- und Nutzungsindikatoren findet die vorliegende Analyse keine eigenständigen Zusammenhänge mit dem Bruttoinlandsprodukt pro Kopf, während für ein OECD-Panel der Jahre 1996 bis 2007 ein positiver Wachstumseffekt der Breitbanddurchdringung berichtet wird (Czernich et al., 2011). Diese Abweichung ist inhaltlich erklärbar: Untersucht wurde dort eine Phase, in der Breitband erst eingeführt wurde und die Durchdringung stark variierte, während der Internetzugang in der EU-27 heute nahezu flächendeckend erreicht ist. Die deskriptive Statistik dieser Arbeit belegt dies mit einem durchschnittlichen Haushaltsinternetzugang von 89,9 Prozent bei einem Maximum von 99,2 Prozent. Wo ein Indikator kaum noch variiert, kann er auch keine Unterschiede mehr erklären.</w:t>
+      </w:r>
     </w:p>
     <w:p>
       <w:pPr>
@@ -18273,8 +18488,28 @@
         <w:jc w:val="both"/>
       </w:pPr>
       <w:r>
-        <w:t>Die Ergebnisse fügen sich in mehrfacher Hinsicht in den in Kapitel 2 dargestellten Forschungsstand ein. Für die digitalen Zugangs- und Nutzungsindikatoren findet die vorliegende Analyse keine eigenständigen Zusammenhänge mit dem Bruttoinlandsprodukt pro Kopf, während für ein OECD-Panel der Jahre 1996 bis 2007 ein positiver Wachstumseffekt der Breitbanddurchdringung berichtet wird (Czernich et al., 2011). Diese Abweichung ist inhaltlich erklärbar: Untersucht wurde dort eine Phase, in der Breitband erst eingeführt wurde und die Durchdringung stark variierte, während der Internetzugang in der EU-27 heute nahezu flächendeckend erreicht ist. Die deskriptive Statistik dieser Arbeit belegt dies mit einem durchschnittlichen Haushaltsinternetzugang von 89,9 Prozent bei einem Maximum von 99,2 Prozent. Wo ein Indikator kaum noch variiert, kann er auch keine Unterschiede mehr erklären.</w:t>
-      </w:r>
+        <w:t>Besonders aufschlussreich ist die Übereinstimmung mit einer Untersuchung für die EU-27, in der der Infrastrukturindex ebenfalls keinen robusten Zusammenhang mit dem Wachstum des Bruttoinlandsprodukts aufweist, während Nutzung und digitales Empowerment stärkere Zusammenhänge zeigen (Evangelista et al., 2014). Die vorliegenden Ergebnisse bestätigen diese Richtung und präzisieren sie: Nicht die Infrastruktur selbst, sondern die Verbindung von Adoption und Humankapital ist mit der wirtschaftlichen Leistungsfähigkeit verbunden. Dass die geschätzte Bedeutung digitaler Technologien erheblich von Analyseebene, Messung und Methode abhängt (Cardona et al., 2013; Niebel, 2018), erklärt zudem die Heteroge</w:t>
+      </w:r>
+      <w:r>
+        <w:t xml:space="preserve">nität der Befundlage insgesamt. </w:t>
+      </w:r>
+      <w:r>
+        <w:t>Die Bedeutung der tatsächlichen Adoption gegenüber der reinen Netzabdeckung (Briglauer et al., 2025) wird durch die vorliegende Analyse um eine weitere Bedingung ergänzt: Der Zusammenhang der Adoption variiert systematisch mit dem Bildungsniveau. Damit verbindet die Arbeit die Literatur zu Informations- und Kommunikationstechnologien und wirtschaftlicher Leistung mit der Digital-Divide-Forschung, in der Bildung als zentrale Determinante gilt (Lythreatis et al., 2022; Cruz-Jesus et al., 2016). Die Clusterergebnisse schließen unmittelbar an die Befunde zur Mehrdimensionalität digitaler Unterschiede innerhalb Europas an (Billon et al., 2010; Vicente &amp; López, 2011; Cruz-Jesus et al., 2012).</w:t>
+      </w:r>
+    </w:p>
+    <w:p>
+      <w:pPr>
+        <w:pStyle w:val="Heading2"/>
+      </w:pPr>
+      <w:r>
+        <w:br w:type="page"/>
+      </w:r>
+      <w:bookmarkStart w:id="36" w:name="_Toc235990793"/>
+      <w:r>
+        <w:lastRenderedPageBreak/>
+        <w:t>5.4 Limitationen</w:t>
+      </w:r>
+      <w:bookmarkEnd w:id="36"/>
     </w:p>
     <w:p>
       <w:pPr>
@@ -18282,7 +18517,7 @@
         <w:jc w:val="both"/>
       </w:pPr>
       <w:r>
-        <w:t>Besonders aufschlussreich ist die Übereinstimmung mit einer Untersuchung für die EU-27, in der der Infrastrukturindex ebenfalls keinen robusten Zusammenhang mit dem Wachstum des Bruttoinlandsprodukts aufweist, während Nutzung und digitales Empowerment stärkere Zusammenhänge zeigen (Evangelista et al., 2014). Die vorliegenden Ergebnisse bestätigen diese Richtung und präzisieren sie: Nicht die Infrastruktur selbst, sondern die Verbindung von Adoption und Humankapital ist mit der wirtschaftlichen Leistungsfähigkeit verbunden. Dass die geschätzte Bedeutung digitaler Technologien erheblich von Analyseebene, Messung und Methode abhängt (Cardona et al., 2013; Niebel, 2018), erklärt zudem die Heterogenität der Befundlage insgesamt.</w:t>
+        <w:t>Die Ergebnisse sind vor dem Hintergrund mehrerer Einschränkungen zu interpretieren.</w:t>
       </w:r>
     </w:p>
     <w:p>
@@ -18291,24 +18526,8 @@
         <w:jc w:val="both"/>
       </w:pPr>
       <w:r>
-        <w:t>Die Bedeutung der tatsächlichen Adoption gegenüber der reinen Netzabdeckung (Briglauer et al., 2025) wird durch die vorliegende Analyse um eine weitere Bedingung ergänzt: Der Zusammenhang der Adoption variiert systematisch mit dem Bildungsniveau. Damit verbindet die Arbeit die Literatur zu Informations- und Kommunikationstechnologien und wirtschaftlicher Leistung mit der Digital-Divide-Forschung, in der Bildung als zentrale Determinante gilt (Lythreatis et al., 2022; Cruz-Jesus et al., 2016). Die Clusterergebnisse schließen unmittelbar an die Befunde zur Mehrdimensionalität digitaler Unterschiede innerhalb Europas an (Billon et al., 2010; Vicente &amp; López, 2011; Cruz-Jesus et al., 2012).</w:t>
-      </w:r>
-    </w:p>
-    <w:p>
-      <w:r>
-        <w:br w:type="page"/>
-      </w:r>
-    </w:p>
-    <w:p>
-      <w:pPr>
-        <w:pStyle w:val="Heading2"/>
-      </w:pPr>
-      <w:bookmarkStart w:id="37" w:name="_Toc235835503"/>
-      <w:r>
-        <w:lastRenderedPageBreak/>
-        <w:t>5.4 Limitationen</w:t>
-      </w:r>
-      <w:bookmarkEnd w:id="37"/>
+        <w:t>Erstens beruht die Untersuchung auf Beobachtungsdaten. Die Modelle mit länder- und jahresspezifischen festen Effekten kontrollieren zwar für zeitkonstante unbeobachtete Ländermerkmale und gemeinsame zeitliche Entwicklungen, erlauben jedoch keine kausale Identifikation. Eine umgekehrte Kausalrichtung ist nicht auszuschließen, da wirtschaftlich leistungsfähigere Mitgliedstaaten über größere Möglichkeiten verfügen, in digitale Infrastruktur, Bildung sowie Forschung und Entwicklung zu investieren. Die berichteten Koeffizienten sind daher als bedingte statistische Zusammenhänge zu verstehen.</w:t>
+      </w:r>
     </w:p>
     <w:p>
       <w:pPr>
@@ -18316,7 +18535,13 @@
         <w:jc w:val="both"/>
       </w:pPr>
       <w:r>
-        <w:t>Die Ergebnisse sind vor dem Hintergrund mehrerer Einschränkungen zu interpretieren.</w:t>
+        <w:t>Zweitens bilden die verwendeten Indikatoren die theoretischen Konzepte digitale Infrastruktur und digitale Adoption nur näherun</w:t>
+      </w:r>
+      <w:r>
+        <w:t>gsweise ab</w:t>
+      </w:r>
+      <w:r>
+        <w:t>. Der Anteil der Haushalte mit Internetzugang und die Zahl der Festnetzbreitbandanschlüsse messen nicht ausschließlich die technische Verfügbarkeit, sondern werden zugleich von Nachfrage, Einkommen und tatsächlicher Nutzung beeinflusst. Ebenso erfasst das Bildungsniveau allgemeine formale Qualifikation und keine spezifischen digitalen oder technischen Kompetenzen.</w:t>
       </w:r>
     </w:p>
     <w:p>
@@ -18325,7 +18550,7 @@
         <w:jc w:val="both"/>
       </w:pPr>
       <w:r>
-        <w:t>Erstens beruht die Untersuchung auf Beobachtungsdaten. Die Modelle mit länder- und jahresspezifischen festen Effekten kontrollieren zwar für zeitkonstante unbeobachtete Ländermerkmale und gemeinsame zeitliche Entwicklungen, erlauben jedoch keine kausale Identifikation. Eine umgekehrte Kausalrichtung ist nicht auszuschließen, da wirtschaftlich leistungsfähigere Mitgliedstaaten über größere Möglichkeiten verfügen, in digitale Infrastruktur, Bildung sowie Forschung und Entwicklung zu investieren. Die berichteten Koeffizienten sind daher als bedingte statistische Zusammenhänge zu verstehen.</w:t>
+        <w:t>Drittens umfasst der Untersuchungszeitraum mit den Jahren 2020 und 2021 die COVID-19-Pandemie. Da die Mitgliedstaaten unterschiedlich stark betroffen waren und unterschiedliche wirtschaftspolitische Maßnahmen ergriffen, können länderspezifische Abweichungen von der allgemeinen zeitlichen Entwicklung bestehen, die jahresspezifische feste Effekte nur begrenzt berücksichtigen.</w:t>
       </w:r>
     </w:p>
     <w:p>
@@ -18334,7 +18559,7 @@
         <w:jc w:val="both"/>
       </w:pPr>
       <w:r>
-        <w:t>Zweitens bilden die verwendeten Indikatoren die theoretischen Konzepte digitale Infrastruktur und digitale Adoption nur näherungsweise ab, wie bereits in den Abschnitten 2.6 und 3.1 angemerkt. Der Anteil der Haushalte mit Internetzugang und die Zahl der Festnetzbreitbandanschlüsse messen nicht ausschließlich die technische Verfügbarkeit, sondern werden zugleich von Nachfrage, Einkommen und tatsächlicher Nutzung beeinflusst. Ebenso erfasst das Bildungsniveau allgemeine formale Qualifikation und keine spezifischen digitalen oder technischen Kompetenzen.</w:t>
+        <w:t>Viertens wurde die Variable Internetkäufe aus zwei aufeinanderfolgenden Eurostat-Datensätzen zusammengeführt, da die Erhebung im Jahr 2020 umgestellt wurde. Ein methodisch bedingter Bruch der Zeitreihe an der Grenze zwischen 2019 und 2020 ist nicht auszuschließen und fällt zeitlich mit dem Beginn der Pandemie zusammen, sodass sich erhebungsbedingte und pandemiebedingte Veränderungen nicht trennen lassen.</w:t>
       </w:r>
     </w:p>
     <w:p>
@@ -18343,7 +18568,13 @@
         <w:jc w:val="both"/>
       </w:pPr>
       <w:r>
-        <w:t>Drittens umfasst der Untersuchungszeitraum mit den Jahren 2020 und 2021 die COVID-19-Pandemie. Da die Mitgliedstaaten unterschiedlich stark betroffen waren und unterschiedliche wirtschaftspolitische Maßnahmen ergriffen, können länderspezifische Abweichungen von der allgemeinen zeitlichen Entwicklung bestehen, die jahresspezifische feste Effekte nur begrenzt berücksichtigen.</w:t>
+        <w:t xml:space="preserve">Fünftens wurden bei der Variable Cloud Computing 87 der 216 Beobachtungen durch lineare Interpolation ergänzt. Die Variable wird deshalb ausschließlich in der explorativen Clusteranalyse und nicht in </w:t>
+      </w:r>
+      <w:r>
+        <w:t>der Regression verwendet. D</w:t>
+      </w:r>
+      <w:r>
+        <w:t>ie interpolierten Werte können jedoch die Zuordnung einzelner Länder beeinflussen.</w:t>
       </w:r>
     </w:p>
     <w:p>
@@ -18352,7 +18583,11 @@
         <w:jc w:val="both"/>
       </w:pPr>
       <w:r>
-        <w:t>Viertens wurde die Variable Internetkäufe aus zwei aufeinanderfolgenden Eurostat-Datensätzen zusammengeführt, da die Erhebung im Jahr 2020 umgestellt wurde. Ein methodisch bedingter Bruch der Zeitreihe an der Grenze zwischen 2019 und 2020 ist nicht auszuschließen und fällt zeitlich mit dem Beginn der Pandemie zusammen, sodass sich erhebungsbedingte und pandemiebedingte Veränderungen nicht trennen lassen.</w:t>
+        <w:t xml:space="preserve">Sechstens beziehen sich sämtliche Ergebnisse auf aggregierte Länderdaten. Da erhebliche digitale Unterschiede auch innerhalb der Mitgliedstaaten bestehen (Vicente &amp; López, 2011; Cruz-Jesus et al., 2016), erlauben die Befunde keine Aussagen über die Verteilung von </w:t>
+      </w:r>
+      <w:r>
+        <w:lastRenderedPageBreak/>
+        <w:t>Digitalisierung und wirtschaftlichen Vorteilen zwischen Regionen oder Bildungsgruppen innerhalb eines Landes.</w:t>
       </w:r>
     </w:p>
     <w:p>
@@ -18361,7 +18596,7 @@
         <w:jc w:val="both"/>
       </w:pPr>
       <w:r>
-        <w:t>Fünftens wurden bei der Variable Cloud Computing 87 der 216 Beobachtungen durch lineare Interpolation ergänzt. Die Variable wird deshalb ausschließlich in der explorativen Clusteranalyse und nicht in der Regression verwendet; die interpolierten Werte können jedoch die Zuordnung einzelner Länder beeinflussen.</w:t>
+        <w:t xml:space="preserve">Siebtens ist die Zahl der Ländercluster mit 27 vergleichsweise gering. Dadurch können die auf Länderebene geclusterten Standardfehler in kleinen Stichproben verzerrt sein. </w:t>
       </w:r>
     </w:p>
     <w:p>
@@ -18370,22 +18605,18 @@
         <w:jc w:val="both"/>
       </w:pPr>
       <w:r>
-        <w:t xml:space="preserve">Sechstens beziehen sich sämtliche Ergebnisse auf aggregierte Länderdaten. Da erhebliche digitale Unterschiede auch innerhalb der Mitgliedstaaten bestehen (Vicente &amp; López, 2011; </w:t>
-      </w:r>
-      <w:r>
-        <w:lastRenderedPageBreak/>
-        <w:t>Cruz-Jesus et al., 2016), erlauben die Befunde keine Aussagen über die Verteilung von Digitalisierung und wirtschaftlichen Vorteilen zwischen Regionen oder Bildungsgruppen innerhalb eines Landes.</w:t>
+        <w:t>Achtens weisen Luxemburg und Irland außergewöhnlich hohe Werte des BIP pro Kopf auf. Diese können unter anderem durch besondere wirtschaftsstrukturelle Faktoren beeinflusst sein und die Schätzergebnisse überproportional prägen. Eine Robustheitsanalyse ohne diese beiden Länder wäre daher eine sinnvolle Ergänzung.</w:t>
       </w:r>
     </w:p>
     <w:p>
       <w:pPr>
         <w:pStyle w:val="Heading2"/>
       </w:pPr>
-      <w:bookmarkStart w:id="38" w:name="_Toc235835504"/>
+      <w:bookmarkStart w:id="37" w:name="_Toc235990794"/>
       <w:r>
         <w:t>5.5 Politische Implikationen</w:t>
       </w:r>
-      <w:bookmarkEnd w:id="38"/>
+      <w:bookmarkEnd w:id="37"/>
     </w:p>
     <w:p>
       <w:pPr>
@@ -18417,7 +18648,19 @@
         <w:jc w:val="both"/>
       </w:pPr>
       <w:r>
-        <w:t>Die konsistenten Zusammenhänge der Forschungs- und Entwicklungsausgaben sowie der Hochtechnologieexporte weisen zudem darauf hin, dass die wirtschaftliche Einordnung der Digitalisierung nicht auf Zugang und Nutzung beschränkt werden sollte. Für die Verringerung des wirtschaftlichen Gefälles zwischen den Mitgliedstaaten erscheint die Förderung von Innovationskapazität und technologieintensiver Produktion ebenso bedeutsam wie die Verbreitung digitaler Anwendungen. Dass die einzelnen Infrastrukturindikatoren keine signifikanten Zusammenhänge aufweisen, bedeutet dabei nicht, dass der Netzausbau wirtschaftlich bedeutungslos ist; Infrastruktur bleibt die Voraussetzung jeder Adoption, ihre wirtschaftlichen Zusammenhänge entfalten sich jedoch erst gemeinsam mit den genannten komplementären Faktoren.</w:t>
+        <w:t>Die konsistenten Zusammenhänge der Forschungs- und Entwicklungsausgaben sowie der Hochtechnologieexporte weisen zudem darauf hin, dass die wirtschaftliche Einordnung der Digitalisierung nicht auf Zugang und Nutzung beschränkt werden sollte. Für die Verringerung des wirtschaftlichen Gefälles zwischen den Mitgliedstaaten erscheint die Förderung von Innovationskapazität und technologieintensiver Produktion ebenso bedeutsam wie die Verbreitung digitaler Anwendungen. Dass die einzelnen Infrastrukturindikatoren keine signifikanten Zusammenhänge aufweisen, bedeutet dabei nicht, dass der Netzausbau wirtschaftlich bedeutungslos</w:t>
+      </w:r>
+      <w:r>
+        <w:t xml:space="preserve"> ist.</w:t>
+      </w:r>
+      <w:r>
+        <w:t xml:space="preserve"> </w:t>
+      </w:r>
+      <w:r>
+        <w:t xml:space="preserve">Die </w:t>
+      </w:r>
+      <w:r>
+        <w:t>Infrastruktur bleibt die Voraussetzung jeder Adoption, ihre wirtschaftlichen Zusammenhänge entfalten sich jedoch erst gemeinsam mit den genannten komplementären Faktoren.</w:t>
       </w:r>
       <w:r>
         <w:tab/>
@@ -18441,11 +18684,11 @@
       <w:pPr>
         <w:pStyle w:val="Heading1"/>
       </w:pPr>
-      <w:bookmarkStart w:id="39" w:name="_Toc235835505"/>
+      <w:bookmarkStart w:id="38" w:name="_Toc235990795"/>
       <w:r>
         <w:t>Kapitel 6: Fazit und Ausblick</w:t>
       </w:r>
-      <w:bookmarkEnd w:id="39"/>
+      <w:bookmarkEnd w:id="38"/>
     </w:p>
     <w:p>
       <w:pPr>
@@ -18460,11 +18703,11 @@
       <w:pPr>
         <w:pStyle w:val="Heading2"/>
       </w:pPr>
-      <w:bookmarkStart w:id="40" w:name="_Toc235835506"/>
+      <w:bookmarkStart w:id="39" w:name="_Toc235990796"/>
       <w:r>
         <w:t>6.1 Beantwortung der Forschungsfrage</w:t>
       </w:r>
-      <w:bookmarkEnd w:id="40"/>
+      <w:bookmarkEnd w:id="39"/>
     </w:p>
     <w:p>
       <w:pPr>
@@ -18481,7 +18724,10 @@
         <w:jc w:val="both"/>
       </w:pPr>
       <w:r>
-        <w:t>Die zweite Teilfrage ergibt, dass die einzelnen Zugangs- und Nutzungsindikatoren keinen eigenständigen Zusammenhang mit dem BIP pro Kopf aufweisen. Positive und signifikante Zusammenhänge bestehen dagegen für F&amp;E-Ausgaben, Hochtechnologieexporte und die Interaktion zwischen digitaler Adoption und Bildung. Der Zusammenhang der Adoption ist somit bildungsabhängig.</w:t>
+        <w:t xml:space="preserve">Die zweite Teilfrage ergibt, dass die einzelnen Zugangs- und Nutzungsindikatoren keinen eigenständigen Zusammenhang mit dem BIP pro Kopf aufweisen. Positive und signifikante Zusammenhänge bestehen dagegen für F&amp;E-Ausgaben, Hochtechnologieexporte und die Interaktion zwischen digitaler Adoption und Bildung. </w:t>
+      </w:r>
+      <w:r>
+        <w:t>Die positiven Interaktionsterme weisen darauf hin, dass der geschätzte Zusammenhang der digitalen Adoption mit steigendem Bildungsniveau positiver wird. Die marginalen Zusammenhänge sind bei einzelnen Bildungswerten jedoch nicht statistisch eindeutig von null verschieden.</w:t>
       </w:r>
     </w:p>
     <w:p>
@@ -18506,11 +18752,11 @@
       <w:pPr>
         <w:pStyle w:val="Heading2"/>
       </w:pPr>
-      <w:bookmarkStart w:id="41" w:name="_Toc235835507"/>
+      <w:bookmarkStart w:id="40" w:name="_Toc235990797"/>
       <w:r>
         <w:t>6.2 Ausblick</w:t>
       </w:r>
-      <w:bookmarkEnd w:id="41"/>
+      <w:bookmarkEnd w:id="40"/>
     </w:p>
     <w:p>
       <w:pPr>
@@ -18523,21 +18769,18 @@
     </w:p>
     <w:p>
       <w:pPr>
-        <w:spacing w:after="120" w:line="360" w:lineRule="auto"/>
-        <w:jc w:val="both"/>
-      </w:pPr>
-      <w:r>
+        <w:pStyle w:val="Heading1"/>
+        <w:rPr>
+          <w:lang w:val="en-US"/>
+        </w:rPr>
+      </w:pPr>
+      <w:r>
+        <w:rPr>
+          <w:lang w:val="en-US"/>
+        </w:rPr>
         <w:br w:type="page"/>
       </w:r>
-    </w:p>
-    <w:p>
-      <w:pPr>
-        <w:pStyle w:val="Heading1"/>
-        <w:rPr>
-          <w:lang w:val="en-US"/>
-        </w:rPr>
-      </w:pPr>
-      <w:bookmarkStart w:id="42" w:name="_Toc235835508"/>
+      <w:bookmarkStart w:id="41" w:name="_Toc235990798"/>
       <w:r>
         <w:rPr>
           <w:lang w:val="en-US"/>
@@ -18545,7 +18788,7 @@
         <w:lastRenderedPageBreak/>
         <w:t>Literaturverzeichnis</w:t>
       </w:r>
-      <w:bookmarkEnd w:id="42"/>
+      <w:bookmarkEnd w:id="41"/>
     </w:p>
     <w:p>
       <w:pPr>
@@ -19412,11 +19655,13 @@
       <w:pPr>
         <w:pStyle w:val="Heading1"/>
       </w:pPr>
-      <w:bookmarkStart w:id="43" w:name="_Toc235835509"/>
+      <w:bookmarkStart w:id="42" w:name="_Toc235990799"/>
+      <w:bookmarkStart w:id="43" w:name="_GoBack"/>
+      <w:bookmarkEnd w:id="43"/>
       <w:r>
         <w:t>Datenquellen</w:t>
       </w:r>
-      <w:bookmarkEnd w:id="43"/>
+      <w:bookmarkEnd w:id="42"/>
     </w:p>
     <w:p>
       <w:pPr>
@@ -19446,8 +19691,6 @@
         <w:jc w:val="both"/>
         <w:rPr>
           <w:rStyle w:val="Hyperlink"/>
-          <w:sz w:val="22"/>
-          <w:szCs w:val="22"/>
           <w:lang w:val="en-US"/>
         </w:rPr>
       </w:pPr>
@@ -19467,8 +19710,337 @@
         </w:r>
       </w:hyperlink>
     </w:p>
+    <w:p>
+      <w:pPr>
+        <w:spacing w:after="120" w:line="276" w:lineRule="auto"/>
+        <w:ind w:left="480" w:hanging="480"/>
+        <w:jc w:val="both"/>
+        <w:rPr>
+          <w:rStyle w:val="Hyperlink"/>
+          <w:lang w:val="en-US"/>
+        </w:rPr>
+      </w:pPr>
+    </w:p>
+    <w:p>
+      <w:pPr>
+        <w:pStyle w:val="Heading1"/>
+        <w:rPr>
+          <w:lang w:val="en-US"/>
+        </w:rPr>
+      </w:pPr>
+      <w:bookmarkStart w:id="44" w:name="_Toc235990800"/>
+      <w:r>
+        <w:rPr>
+          <w:lang w:val="en-US"/>
+        </w:rPr>
+        <w:t>Codequellen</w:t>
+      </w:r>
+      <w:bookmarkEnd w:id="44"/>
+    </w:p>
+    <w:p>
+      <w:pPr>
+        <w:spacing w:after="120" w:line="276" w:lineRule="auto"/>
+        <w:ind w:left="480" w:hanging="480"/>
+        <w:jc w:val="both"/>
+        <w:rPr>
+          <w:rStyle w:val="Hyperlink"/>
+          <w:lang w:val="en-US"/>
+        </w:rPr>
+      </w:pPr>
+      <w:r>
+        <w:rPr>
+          <w:rStyle w:val="Hyperlink"/>
+          <w:lang w:val="en-US"/>
+        </w:rPr>
+        <w:t>https://github.com/Mo2070/Bachelorarbeit</w:t>
+      </w:r>
+    </w:p>
+    <w:p>
+      <w:pPr>
+        <w:spacing w:after="120" w:line="276" w:lineRule="auto"/>
+        <w:ind w:left="480" w:hanging="480"/>
+        <w:jc w:val="both"/>
+        <w:rPr>
+          <w:rStyle w:val="Hyperlink"/>
+          <w:lang w:val="en-US"/>
+        </w:rPr>
+      </w:pPr>
+    </w:p>
+    <w:p>
+      <w:pPr>
+        <w:spacing w:after="120" w:line="276" w:lineRule="auto"/>
+        <w:ind w:left="480" w:hanging="480"/>
+        <w:jc w:val="both"/>
+        <w:rPr>
+          <w:rStyle w:val="Hyperlink"/>
+          <w:lang w:val="en-US"/>
+        </w:rPr>
+      </w:pPr>
+    </w:p>
+    <w:p>
+      <w:pPr>
+        <w:spacing w:after="120" w:line="276" w:lineRule="auto"/>
+        <w:ind w:left="480" w:hanging="480"/>
+        <w:jc w:val="both"/>
+        <w:rPr>
+          <w:rStyle w:val="Hyperlink"/>
+          <w:lang w:val="en-US"/>
+        </w:rPr>
+      </w:pPr>
+    </w:p>
+    <w:p>
+      <w:pPr>
+        <w:spacing w:after="120" w:line="276" w:lineRule="auto"/>
+        <w:ind w:left="480" w:hanging="480"/>
+        <w:jc w:val="both"/>
+        <w:rPr>
+          <w:rStyle w:val="Hyperlink"/>
+          <w:lang w:val="en-US"/>
+        </w:rPr>
+      </w:pPr>
+    </w:p>
+    <w:p>
+      <w:pPr>
+        <w:spacing w:after="120" w:line="276" w:lineRule="auto"/>
+        <w:ind w:left="480" w:hanging="480"/>
+        <w:jc w:val="both"/>
+        <w:rPr>
+          <w:rStyle w:val="Hyperlink"/>
+          <w:lang w:val="en-US"/>
+        </w:rPr>
+      </w:pPr>
+    </w:p>
+    <w:p>
+      <w:pPr>
+        <w:spacing w:after="120" w:line="276" w:lineRule="auto"/>
+        <w:ind w:left="480" w:hanging="480"/>
+        <w:jc w:val="both"/>
+        <w:rPr>
+          <w:rStyle w:val="Hyperlink"/>
+          <w:lang w:val="en-US"/>
+        </w:rPr>
+      </w:pPr>
+    </w:p>
+    <w:p>
+      <w:pPr>
+        <w:spacing w:after="120" w:line="276" w:lineRule="auto"/>
+        <w:ind w:left="480" w:hanging="480"/>
+        <w:jc w:val="both"/>
+        <w:rPr>
+          <w:rStyle w:val="Hyperlink"/>
+          <w:lang w:val="en-US"/>
+        </w:rPr>
+      </w:pPr>
+    </w:p>
+    <w:p>
+      <w:pPr>
+        <w:spacing w:after="120" w:line="276" w:lineRule="auto"/>
+        <w:ind w:left="480" w:hanging="480"/>
+        <w:jc w:val="both"/>
+        <w:rPr>
+          <w:rStyle w:val="Hyperlink"/>
+          <w:lang w:val="en-US"/>
+        </w:rPr>
+      </w:pPr>
+    </w:p>
+    <w:p>
+      <w:pPr>
+        <w:spacing w:after="120" w:line="276" w:lineRule="auto"/>
+        <w:ind w:left="480" w:hanging="480"/>
+        <w:jc w:val="both"/>
+        <w:rPr>
+          <w:rStyle w:val="Hyperlink"/>
+          <w:lang w:val="en-US"/>
+        </w:rPr>
+      </w:pPr>
+    </w:p>
+    <w:p>
+      <w:pPr>
+        <w:spacing w:after="120" w:line="276" w:lineRule="auto"/>
+        <w:ind w:left="480" w:hanging="480"/>
+        <w:jc w:val="both"/>
+        <w:rPr>
+          <w:rStyle w:val="Hyperlink"/>
+          <w:lang w:val="en-US"/>
+        </w:rPr>
+      </w:pPr>
+    </w:p>
+    <w:p>
+      <w:pPr>
+        <w:spacing w:after="120" w:line="276" w:lineRule="auto"/>
+        <w:ind w:left="480" w:hanging="480"/>
+        <w:jc w:val="both"/>
+        <w:rPr>
+          <w:rStyle w:val="Hyperlink"/>
+          <w:lang w:val="en-US"/>
+        </w:rPr>
+      </w:pPr>
+    </w:p>
+    <w:p>
+      <w:pPr>
+        <w:spacing w:after="120" w:line="276" w:lineRule="auto"/>
+        <w:ind w:left="480" w:hanging="480"/>
+        <w:jc w:val="both"/>
+        <w:rPr>
+          <w:rStyle w:val="Hyperlink"/>
+          <w:lang w:val="en-US"/>
+        </w:rPr>
+      </w:pPr>
+    </w:p>
+    <w:p>
+      <w:pPr>
+        <w:spacing w:after="120" w:line="276" w:lineRule="auto"/>
+        <w:ind w:left="480" w:hanging="480"/>
+        <w:jc w:val="both"/>
+        <w:rPr>
+          <w:rStyle w:val="Hyperlink"/>
+          <w:lang w:val="en-US"/>
+        </w:rPr>
+      </w:pPr>
+    </w:p>
+    <w:p>
+      <w:pPr>
+        <w:spacing w:after="120" w:line="276" w:lineRule="auto"/>
+        <w:ind w:left="480" w:hanging="480"/>
+        <w:jc w:val="both"/>
+        <w:rPr>
+          <w:rStyle w:val="Hyperlink"/>
+          <w:lang w:val="en-US"/>
+        </w:rPr>
+      </w:pPr>
+    </w:p>
+    <w:p>
+      <w:pPr>
+        <w:spacing w:after="120" w:line="276" w:lineRule="auto"/>
+        <w:ind w:left="480" w:hanging="480"/>
+        <w:jc w:val="both"/>
+        <w:rPr>
+          <w:rStyle w:val="Hyperlink"/>
+          <w:lang w:val="en-US"/>
+        </w:rPr>
+      </w:pPr>
+    </w:p>
+    <w:p>
+      <w:pPr>
+        <w:spacing w:after="120" w:line="276" w:lineRule="auto"/>
+        <w:ind w:left="480" w:hanging="480"/>
+        <w:jc w:val="both"/>
+        <w:rPr>
+          <w:rStyle w:val="Hyperlink"/>
+          <w:lang w:val="en-US"/>
+        </w:rPr>
+      </w:pPr>
+    </w:p>
+    <w:p>
+      <w:pPr>
+        <w:spacing w:after="120" w:line="276" w:lineRule="auto"/>
+        <w:ind w:left="480" w:hanging="480"/>
+        <w:jc w:val="both"/>
+        <w:rPr>
+          <w:rStyle w:val="Hyperlink"/>
+          <w:lang w:val="en-US"/>
+        </w:rPr>
+      </w:pPr>
+    </w:p>
+    <w:p>
+      <w:pPr>
+        <w:spacing w:after="120" w:line="276" w:lineRule="auto"/>
+        <w:ind w:left="480" w:hanging="480"/>
+        <w:jc w:val="both"/>
+        <w:rPr>
+          <w:rStyle w:val="Hyperlink"/>
+          <w:lang w:val="en-US"/>
+        </w:rPr>
+      </w:pPr>
+    </w:p>
+    <w:p>
+      <w:pPr>
+        <w:spacing w:after="120" w:line="276" w:lineRule="auto"/>
+        <w:ind w:left="480" w:hanging="480"/>
+        <w:jc w:val="both"/>
+        <w:rPr>
+          <w:rStyle w:val="Hyperlink"/>
+          <w:lang w:val="en-US"/>
+        </w:rPr>
+      </w:pPr>
+    </w:p>
+    <w:p>
+      <w:pPr>
+        <w:spacing w:after="120" w:line="360" w:lineRule="auto"/>
+        <w:jc w:val="both"/>
+        <w:rPr>
+          <w:lang w:val="en-US"/>
+        </w:rPr>
+      </w:pPr>
+    </w:p>
+    <w:p>
+      <w:pPr>
+        <w:spacing w:after="120" w:line="360" w:lineRule="auto"/>
+        <w:jc w:val="both"/>
+        <w:rPr>
+          <w:lang w:val="en-US"/>
+        </w:rPr>
+      </w:pPr>
+      <w:r>
+        <w:rPr>
+          <w:noProof/>
+        </w:rPr>
+        <w:lastRenderedPageBreak/>
+        <w:drawing>
+          <wp:inline distT="0" distB="0" distL="0" distR="0">
+            <wp:extent cx="6101568" cy="8791175"/>
+            <wp:effectExtent l="0" t="0" r="0" b="0"/>
+            <wp:docPr id="6" name="Picture 6" descr="C:\Users\LEGION\AppData\Local\Packages\5319275A.WhatsAppDesktop_cv1g1gvanyjgm\LocalState\sessions\0F544B76AAA533211A25F6994D9F527978C0AF50\transfers\2026-30\WhatsApp Image 2026-07-26 at 20.18.00.jpeg"/>
+            <wp:cNvGraphicFramePr>
+              <a:graphicFrameLocks xmlns:a="http://schemas.openxmlformats.org/drawingml/2006/main" noChangeAspect="1"/>
+            </wp:cNvGraphicFramePr>
+            <a:graphic xmlns:a="http://schemas.openxmlformats.org/drawingml/2006/main">
+              <a:graphicData uri="http://schemas.openxmlformats.org/drawingml/2006/picture">
+                <pic:pic xmlns:pic="http://schemas.openxmlformats.org/drawingml/2006/picture">
+                  <pic:nvPicPr>
+                    <pic:cNvPr id="0" name="Picture 1" descr="C:\Users\LEGION\AppData\Local\Packages\5319275A.WhatsAppDesktop_cv1g1gvanyjgm\LocalState\sessions\0F544B76AAA533211A25F6994D9F527978C0AF50\transfers\2026-30\WhatsApp Image 2026-07-26 at 20.18.00.jpeg"/>
+                    <pic:cNvPicPr>
+                      <a:picLocks noChangeAspect="1" noChangeArrowheads="1"/>
+                    </pic:cNvPicPr>
+                  </pic:nvPicPr>
+                  <pic:blipFill rotWithShape="1">
+                    <a:blip r:embed="rId55">
+                      <a:extLst>
+                        <a:ext uri="{28A0092B-C50C-407E-A947-70E740481C1C}">
+                          <a14:useLocalDpi xmlns:a14="http://schemas.microsoft.com/office/drawing/2010/main" val="0"/>
+                        </a:ext>
+                      </a:extLst>
+                    </a:blip>
+                    <a:srcRect t="1811" r="771"/>
+                    <a:stretch/>
+                  </pic:blipFill>
+                  <pic:spPr bwMode="auto">
+                    <a:xfrm>
+                      <a:off x="0" y="0"/>
+                      <a:ext cx="6121167" cy="8819413"/>
+                    </a:xfrm>
+                    <a:prstGeom prst="rect">
+                      <a:avLst/>
+                    </a:prstGeom>
+                    <a:noFill/>
+                    <a:ln>
+                      <a:noFill/>
+                    </a:ln>
+                    <a:extLst>
+                      <a:ext uri="{53640926-AAD7-44D8-BBD7-CCE9431645EC}">
+                        <a14:shadowObscured xmlns:a14="http://schemas.microsoft.com/office/drawing/2010/main"/>
+                      </a:ext>
+                    </a:extLst>
+                  </pic:spPr>
+                </pic:pic>
+              </a:graphicData>
+            </a:graphic>
+          </wp:inline>
+        </w:drawing>
+      </w:r>
+    </w:p>
     <w:sectPr>
-      <w:footerReference w:type="default" r:id="rId55"/>
+      <w:footerReference w:type="default" r:id="rId56"/>
       <w:pgSz w:w="11906" w:h="16838"/>
       <w:pgMar w:top="1440" w:right="1440" w:bottom="1440" w:left="1440" w:header="708" w:footer="708" w:gutter="0"/>
       <w:cols w:space="720"/>
@@ -19530,7 +20102,7 @@
         <w:sz w:val="20"/>
         <w:szCs w:val="20"/>
       </w:rPr>
-      <w:t>21</w:t>
+      <w:t>39</w:t>
     </w:r>
     <w:r>
       <w:rPr>
@@ -20682,7 +21254,7 @@
 </file>
 
 <file path=customXml/itemProps1.xml><?xml version="1.0" encoding="utf-8"?>
-<ds:datastoreItem xmlns:ds="http://schemas.openxmlformats.org/officeDocument/2006/customXml" ds:itemID="{CB11DAE4-3169-4C3D-A08B-AFD63A5D6465}">
+<ds:datastoreItem xmlns:ds="http://schemas.openxmlformats.org/officeDocument/2006/customXml" ds:itemID="{ECCFD9BB-8838-41B3-82E1-B7E8B0423AFD}">
   <ds:schemaRefs>
     <ds:schemaRef ds:uri="http://schemas.openxmlformats.org/officeDocument/2006/bibliography"/>
   </ds:schemaRefs>

</xml_diff>